<commit_message>
Wrote inspiration and similar section of documentation
</commit_message>
<xml_diff>
--- a/documentation/George Cooke - Theatre Booking Documentation.docx
+++ b/documentation/George Cooke - Theatre Booking Documentation.docx
@@ -764,13 +764,520 @@
         <w:t>Similar Programs &amp; Inspiration</w:t>
       </w:r>
     </w:p>
+    <w:p>
+      <w:r>
+        <w:t xml:space="preserve">There are a multitude of different booking apps used around the world for all different purposes. Some are to book tickets to films, other for music festivals, some for sports, and some for </w:t>
+      </w:r>
+      <w:r>
+        <w:t>aircraft seats</w:t>
+      </w:r>
+      <w:r>
+        <w:t xml:space="preserve">. </w:t>
+      </w:r>
+      <w:r>
+        <w:t>Going into this project the correlation that immediately jumped out to me was with booking tickets to the cinema.</w:t>
+      </w:r>
+      <w:r>
+        <w:t xml:space="preserve"> With the presence of assigned seating</w:t>
+      </w:r>
+      <w:r>
+        <w:t xml:space="preserve"> on a regular layout with showings that may not have predictable or consistent showing dates</w:t>
+      </w:r>
+      <w:r>
+        <w:t>.</w:t>
+      </w:r>
+    </w:p>
+    <w:p>
+      <w:r>
+        <w:tab/>
+        <w:t xml:space="preserve">The programs I aim to take inspiration from </w:t>
+      </w:r>
+      <w:r>
+        <w:t>are the Cineworld and Everyman cinemas. These are two good examples of seating booking systems that I have experience using</w:t>
+      </w:r>
+      <w:r>
+        <w:t xml:space="preserve"> and the layouts of these tools have been well tested and refined over the years that they have been in use.</w:t>
+      </w:r>
+    </w:p>
+    <w:p>
+      <w:r>
+        <w:drawing>
+          <wp:anchor distT="0" distB="0" distL="114300" distR="114300" simplePos="0" relativeHeight="251659264" behindDoc="1" locked="0" layoutInCell="1" allowOverlap="1" wp14:anchorId="5D6AC07E" wp14:editId="7CD61846">
+            <wp:simplePos x="0" y="0"/>
+            <wp:positionH relativeFrom="margin">
+              <wp:align>right</wp:align>
+            </wp:positionH>
+            <wp:positionV relativeFrom="paragraph">
+              <wp:posOffset>1905</wp:posOffset>
+            </wp:positionV>
+            <wp:extent cx="3521710" cy="1685925"/>
+            <wp:effectExtent l="0" t="0" r="2540" b="9525"/>
+            <wp:wrapTight wrapText="bothSides">
+              <wp:wrapPolygon edited="0">
+                <wp:start x="0" y="0"/>
+                <wp:lineTo x="0" y="21478"/>
+                <wp:lineTo x="21499" y="21478"/>
+                <wp:lineTo x="21499" y="0"/>
+                <wp:lineTo x="0" y="0"/>
+              </wp:wrapPolygon>
+            </wp:wrapTight>
+            <wp:docPr id="791366962" name="Picture 1"/>
+            <wp:cNvGraphicFramePr>
+              <a:graphicFrameLocks xmlns:a="http://schemas.openxmlformats.org/drawingml/2006/main" noChangeAspect="1"/>
+            </wp:cNvGraphicFramePr>
+            <a:graphic xmlns:a="http://schemas.openxmlformats.org/drawingml/2006/main">
+              <a:graphicData uri="http://schemas.openxmlformats.org/drawingml/2006/picture">
+                <pic:pic xmlns:pic="http://schemas.openxmlformats.org/drawingml/2006/picture">
+                  <pic:nvPicPr>
+                    <pic:cNvPr id="791366962" name=""/>
+                    <pic:cNvPicPr/>
+                  </pic:nvPicPr>
+                  <pic:blipFill>
+                    <a:blip r:embed="rId8" cstate="print">
+                      <a:extLst>
+                        <a:ext uri="{28A0092B-C50C-407E-A947-70E740481C1C}">
+                          <a14:useLocalDpi xmlns:a14="http://schemas.microsoft.com/office/drawing/2010/main" val="0"/>
+                        </a:ext>
+                      </a:extLst>
+                    </a:blip>
+                    <a:stretch>
+                      <a:fillRect/>
+                    </a:stretch>
+                  </pic:blipFill>
+                  <pic:spPr>
+                    <a:xfrm>
+                      <a:off x="0" y="0"/>
+                      <a:ext cx="3521710" cy="1685925"/>
+                    </a:xfrm>
+                    <a:prstGeom prst="rect">
+                      <a:avLst/>
+                    </a:prstGeom>
+                  </pic:spPr>
+                </pic:pic>
+              </a:graphicData>
+            </a:graphic>
+            <wp14:sizeRelH relativeFrom="margin">
+              <wp14:pctWidth>0</wp14:pctWidth>
+            </wp14:sizeRelH>
+            <wp14:sizeRelV relativeFrom="margin">
+              <wp14:pctHeight>0</wp14:pctHeight>
+            </wp14:sizeRelV>
+          </wp:anchor>
+        </w:drawing>
+      </w:r>
+      <w:r>
+        <w:tab/>
+        <w:t xml:space="preserve">The image to the right is a screenshot of the </w:t>
+      </w:r>
+      <w:r>
+        <w:t xml:space="preserve">Everyman website displaying the different </w:t>
+      </w:r>
+      <w:r>
+        <w:t xml:space="preserve">films available. I like the possibility to go straight in to book specific dates and times for the films and will likely incorporate this as a target for my own program. Other than that, I like the presence of a description </w:t>
+      </w:r>
+      <w:r>
+        <w:t xml:space="preserve">which is something I will copy for my own program. I will also take from this the horizontal line separating the different films. I believe that this will </w:t>
+      </w:r>
+      <w:r>
+        <w:t>lead to a less cluttered appearance compared to my previous program with many boxes with rounded corners.</w:t>
+      </w:r>
+    </w:p>
+    <w:p>
+      <w:r>
+        <w:tab/>
+        <w:t xml:space="preserve">From the above page, a person can click on the title and go into </w:t>
+      </w:r>
+      <w:r>
+        <w:t>further information and date/time selection. My program will assume that all showings are at the same time and there is a maximum of one showing per day per performance but there can be multiple performances at once in different rooms (it could be a stretch target to extend this to having separate time slots).</w:t>
+      </w:r>
+      <w:r>
+        <w:t xml:space="preserve"> I will likely replace this page with a custom one</w:t>
+      </w:r>
+      <w:r>
+        <w:t xml:space="preserve"> of my own design with just a number of simple buttons each with the date that they represent.</w:t>
+      </w:r>
+    </w:p>
+    <w:p>
+      <w:r>
+        <w:t xml:space="preserve"> </w:t>
+      </w:r>
+    </w:p>
+    <w:p>
+      <w:r>
+        <w:lastRenderedPageBreak/>
+        <w:drawing>
+          <wp:anchor distT="0" distB="0" distL="114300" distR="114300" simplePos="0" relativeHeight="251661312" behindDoc="0" locked="0" layoutInCell="1" allowOverlap="1" wp14:anchorId="340DA751" wp14:editId="2530451F">
+            <wp:simplePos x="0" y="0"/>
+            <wp:positionH relativeFrom="margin">
+              <wp:align>right</wp:align>
+            </wp:positionH>
+            <wp:positionV relativeFrom="paragraph">
+              <wp:posOffset>-760941</wp:posOffset>
+            </wp:positionV>
+            <wp:extent cx="2065020" cy="2404745"/>
+            <wp:effectExtent l="0" t="0" r="0" b="0"/>
+            <wp:wrapTight wrapText="bothSides">
+              <wp:wrapPolygon edited="0">
+                <wp:start x="0" y="0"/>
+                <wp:lineTo x="0" y="21389"/>
+                <wp:lineTo x="21321" y="21389"/>
+                <wp:lineTo x="21321" y="0"/>
+                <wp:lineTo x="0" y="0"/>
+              </wp:wrapPolygon>
+            </wp:wrapTight>
+            <wp:docPr id="1217246317" name="Picture 1"/>
+            <wp:cNvGraphicFramePr>
+              <a:graphicFrameLocks xmlns:a="http://schemas.openxmlformats.org/drawingml/2006/main" noChangeAspect="1"/>
+            </wp:cNvGraphicFramePr>
+            <a:graphic xmlns:a="http://schemas.openxmlformats.org/drawingml/2006/main">
+              <a:graphicData uri="http://schemas.openxmlformats.org/drawingml/2006/picture">
+                <pic:pic xmlns:pic="http://schemas.openxmlformats.org/drawingml/2006/picture">
+                  <pic:nvPicPr>
+                    <pic:cNvPr id="1217246317" name=""/>
+                    <pic:cNvPicPr/>
+                  </pic:nvPicPr>
+                  <pic:blipFill>
+                    <a:blip r:embed="rId9"/>
+                    <a:stretch>
+                      <a:fillRect/>
+                    </a:stretch>
+                  </pic:blipFill>
+                  <pic:spPr>
+                    <a:xfrm>
+                      <a:off x="0" y="0"/>
+                      <a:ext cx="2065020" cy="2404745"/>
+                    </a:xfrm>
+                    <a:prstGeom prst="rect">
+                      <a:avLst/>
+                    </a:prstGeom>
+                  </pic:spPr>
+                </pic:pic>
+              </a:graphicData>
+            </a:graphic>
+            <wp14:sizeRelH relativeFrom="margin">
+              <wp14:pctWidth>0</wp14:pctWidth>
+            </wp14:sizeRelH>
+            <wp14:sizeRelV relativeFrom="margin">
+              <wp14:pctHeight>0</wp14:pctHeight>
+            </wp14:sizeRelV>
+          </wp:anchor>
+        </w:drawing>
+      </w:r>
+      <w:r>
+        <w:tab/>
+        <w:t xml:space="preserve">Having selected a date and time in the Everyman website, a user is sent to the seat selection page pictured to the right. I will copy from this the presence of a colour coded seat map and the key. With the Everyman website, there is a lot of white space to the right of this. I will likely replace this in my own </w:t>
+      </w:r>
+      <w:r>
+        <w:t>section</w:t>
+      </w:r>
+      <w:r>
+        <w:t xml:space="preserve"> with a way of selecting which kinds of people will be attending (as the brief dictates that children and the elderly have </w:t>
+      </w:r>
+      <w:r>
+        <w:t>tickets</w:t>
+      </w:r>
+      <w:r>
+        <w:t xml:space="preserve"> at half price)</w:t>
+      </w:r>
+      <w:r>
+        <w:t>.</w:t>
+      </w:r>
+    </w:p>
+    <w:p>
+      <w:pPr>
+        <w:rPr>
+          <w:noProof/>
+        </w:rPr>
+      </w:pPr>
+      <w:r>
+        <w:drawing>
+          <wp:anchor distT="0" distB="0" distL="114300" distR="114300" simplePos="0" relativeHeight="251663360" behindDoc="0" locked="0" layoutInCell="1" allowOverlap="1" wp14:anchorId="751A75DE" wp14:editId="0E9B7D51">
+            <wp:simplePos x="0" y="0"/>
+            <wp:positionH relativeFrom="margin">
+              <wp:posOffset>3022600</wp:posOffset>
+            </wp:positionH>
+            <wp:positionV relativeFrom="paragraph">
+              <wp:posOffset>414232</wp:posOffset>
+            </wp:positionV>
+            <wp:extent cx="2708910" cy="1031240"/>
+            <wp:effectExtent l="0" t="0" r="0" b="0"/>
+            <wp:wrapTight wrapText="bothSides">
+              <wp:wrapPolygon edited="0">
+                <wp:start x="0" y="0"/>
+                <wp:lineTo x="0" y="21148"/>
+                <wp:lineTo x="21418" y="21148"/>
+                <wp:lineTo x="21418" y="0"/>
+                <wp:lineTo x="0" y="0"/>
+              </wp:wrapPolygon>
+            </wp:wrapTight>
+            <wp:docPr id="777523774" name="Picture 1"/>
+            <wp:cNvGraphicFramePr>
+              <a:graphicFrameLocks xmlns:a="http://schemas.openxmlformats.org/drawingml/2006/main" noChangeAspect="1"/>
+            </wp:cNvGraphicFramePr>
+            <a:graphic xmlns:a="http://schemas.openxmlformats.org/drawingml/2006/main">
+              <a:graphicData uri="http://schemas.openxmlformats.org/drawingml/2006/picture">
+                <pic:pic xmlns:pic="http://schemas.openxmlformats.org/drawingml/2006/picture">
+                  <pic:nvPicPr>
+                    <pic:cNvPr id="777523774" name=""/>
+                    <pic:cNvPicPr/>
+                  </pic:nvPicPr>
+                  <pic:blipFill>
+                    <a:blip r:embed="rId10"/>
+                    <a:stretch>
+                      <a:fillRect/>
+                    </a:stretch>
+                  </pic:blipFill>
+                  <pic:spPr>
+                    <a:xfrm>
+                      <a:off x="0" y="0"/>
+                      <a:ext cx="2708910" cy="1031240"/>
+                    </a:xfrm>
+                    <a:prstGeom prst="rect">
+                      <a:avLst/>
+                    </a:prstGeom>
+                  </pic:spPr>
+                </pic:pic>
+              </a:graphicData>
+            </a:graphic>
+            <wp14:sizeRelH relativeFrom="margin">
+              <wp14:pctWidth>0</wp14:pctWidth>
+            </wp14:sizeRelH>
+            <wp14:sizeRelV relativeFrom="margin">
+              <wp14:pctHeight>0</wp14:pctHeight>
+            </wp14:sizeRelV>
+          </wp:anchor>
+        </w:drawing>
+      </w:r>
+      <w:r>
+        <w:tab/>
+        <w:t>Cineworld has a very similar way of displaying what films are on (pictured right under Everyman)</w:t>
+      </w:r>
+      <w:r>
+        <w:rPr>
+          <w:noProof/>
+        </w:rPr>
+        <w:t>. Again, I will draw inspiration from this with the vertical lines</w:t>
+      </w:r>
+      <w:r>
+        <w:rPr>
+          <w:noProof/>
+        </w:rPr>
+        <w:t>. One thing that Cineworld lacks compared to the Everyman is the description of each film</w:t>
+      </w:r>
+      <w:r>
+        <w:rPr>
+          <w:noProof/>
+        </w:rPr>
+        <w:t xml:space="preserve"> on this page with a user having to go into the furtehr details of the film to see</w:t>
+      </w:r>
+      <w:r>
+        <w:rPr>
+          <w:noProof/>
+        </w:rPr>
+        <w:t>. I personally prefer Everyman’s approach and will be incorporating it into my design.</w:t>
+      </w:r>
+      <w:r>
+        <w:rPr>
+          <w:noProof/>
+        </w:rPr>
+        <w:t xml:space="preserve"> This difference could be as a reuslt of Everyman’s propensity to show more indie and unknown films with the cinema itself being the event rather than the film. This means that they have to give a little more information about the film</w:t>
+      </w:r>
+      <w:r>
+        <w:rPr>
+          <w:noProof/>
+        </w:rPr>
+        <w:t>s as people may not have heard of them whereas people would go to Cineworld with the intention of watching a specific film that they have already picked out.</w:t>
+      </w:r>
+    </w:p>
+    <w:p>
+      <w:pPr>
+        <w:rPr>
+          <w:noProof/>
+        </w:rPr>
+      </w:pPr>
+      <w:r>
+        <w:rPr>
+          <w:noProof/>
+        </w:rPr>
+        <w:drawing>
+          <wp:anchor distT="0" distB="0" distL="114300" distR="114300" simplePos="0" relativeHeight="251665408" behindDoc="0" locked="0" layoutInCell="1" allowOverlap="1" wp14:anchorId="2B8B8457" wp14:editId="2292440D">
+            <wp:simplePos x="0" y="0"/>
+            <wp:positionH relativeFrom="margin">
+              <wp:align>right</wp:align>
+            </wp:positionH>
+            <wp:positionV relativeFrom="paragraph">
+              <wp:posOffset>8678</wp:posOffset>
+            </wp:positionV>
+            <wp:extent cx="1633220" cy="1390650"/>
+            <wp:effectExtent l="0" t="0" r="5080" b="0"/>
+            <wp:wrapTight wrapText="bothSides">
+              <wp:wrapPolygon edited="0">
+                <wp:start x="0" y="0"/>
+                <wp:lineTo x="0" y="21304"/>
+                <wp:lineTo x="21415" y="21304"/>
+                <wp:lineTo x="21415" y="0"/>
+                <wp:lineTo x="0" y="0"/>
+              </wp:wrapPolygon>
+            </wp:wrapTight>
+            <wp:docPr id="667254193" name="Picture 1"/>
+            <wp:cNvGraphicFramePr>
+              <a:graphicFrameLocks xmlns:a="http://schemas.openxmlformats.org/drawingml/2006/main" noChangeAspect="1"/>
+            </wp:cNvGraphicFramePr>
+            <a:graphic xmlns:a="http://schemas.openxmlformats.org/drawingml/2006/main">
+              <a:graphicData uri="http://schemas.openxmlformats.org/drawingml/2006/picture">
+                <pic:pic xmlns:pic="http://schemas.openxmlformats.org/drawingml/2006/picture">
+                  <pic:nvPicPr>
+                    <pic:cNvPr id="667254193" name=""/>
+                    <pic:cNvPicPr/>
+                  </pic:nvPicPr>
+                  <pic:blipFill>
+                    <a:blip r:embed="rId11"/>
+                    <a:stretch>
+                      <a:fillRect/>
+                    </a:stretch>
+                  </pic:blipFill>
+                  <pic:spPr>
+                    <a:xfrm>
+                      <a:off x="0" y="0"/>
+                      <a:ext cx="1633220" cy="1390650"/>
+                    </a:xfrm>
+                    <a:prstGeom prst="rect">
+                      <a:avLst/>
+                    </a:prstGeom>
+                  </pic:spPr>
+                </pic:pic>
+              </a:graphicData>
+            </a:graphic>
+            <wp14:sizeRelH relativeFrom="margin">
+              <wp14:pctWidth>0</wp14:pctWidth>
+            </wp14:sizeRelH>
+            <wp14:sizeRelV relativeFrom="margin">
+              <wp14:pctHeight>0</wp14:pctHeight>
+            </wp14:sizeRelV>
+          </wp:anchor>
+        </w:drawing>
+      </w:r>
+      <w:r>
+        <w:rPr>
+          <w:noProof/>
+        </w:rPr>
+        <w:tab/>
+        <w:t xml:space="preserve">Cineworld makes a user select the number of seats that they want before going to the page for selecting seast (prictured right). I believe this is clunky and convelouted in a way that I do not want to incorporate into my own design. It also mean that in selection a user </w:t>
+      </w:r>
+      <w:r>
+        <w:rPr>
+          <w:noProof/>
+        </w:rPr>
+        <w:t>has to go through a complicated process of queueing up seats to unselect a seat they don’t want if they don’t want to go with the seats that were automatically assigned to them.</w:t>
+      </w:r>
+    </w:p>
+    <w:p>
+      <w:pPr>
+        <w:rPr>
+          <w:noProof/>
+        </w:rPr>
+      </w:pPr>
+      <w:r>
+        <w:rPr>
+          <w:noProof/>
+        </w:rPr>
+        <w:tab/>
+        <w:t>Ultimately, both platforms have strong</w:t>
+      </w:r>
+      <w:r>
+        <w:rPr>
+          <w:noProof/>
+        </w:rPr>
+        <w:t xml:space="preserve"> foundations and have been built on years of experience that I can draw inspiration from. I personally prefer the way that the Everyman uses </w:t>
+      </w:r>
+      <w:r>
+        <w:rPr>
+          <w:noProof/>
+        </w:rPr>
+        <w:t xml:space="preserve">and will be using manyof their design principals in my own work. </w:t>
+      </w:r>
+      <w:r>
+        <w:rPr>
+          <w:noProof/>
+        </w:rPr>
+        <w:t>That being said, the differences are very minor. This will mean that users will be used to a certain way of doing things. If I stick to this template, I be able to leave minimal instructions to users and I will be able to inherrit their experience with other similar platforms.</w:t>
+      </w:r>
+    </w:p>
     <w:p/>
     <w:p>
       <w:pPr>
         <w:pStyle w:val="Heading1"/>
       </w:pPr>
       <w:r>
+        <w:lastRenderedPageBreak/>
         <w:t>Stakeholders</w:t>
+      </w:r>
+    </w:p>
+    <w:p>
+      <w:pPr>
+        <w:rPr>
+          <w:b/>
+          <w:bCs/>
+        </w:rPr>
+      </w:pPr>
+      <w:r>
+        <w:rPr>
+          <w:b/>
+          <w:bCs/>
+        </w:rPr>
+        <w:t>Performers:</w:t>
+      </w:r>
+    </w:p>
+    <w:p>
+      <w:pPr>
+        <w:rPr>
+          <w:b/>
+          <w:bCs/>
+        </w:rPr>
+      </w:pPr>
+      <w:r>
+        <w:rPr>
+          <w:b/>
+          <w:bCs/>
+        </w:rPr>
+        <w:t>Admin Staff:</w:t>
+      </w:r>
+    </w:p>
+    <w:p>
+      <w:pPr>
+        <w:rPr>
+          <w:b/>
+          <w:bCs/>
+        </w:rPr>
+      </w:pPr>
+      <w:r>
+        <w:rPr>
+          <w:b/>
+          <w:bCs/>
+        </w:rPr>
+        <w:t>Visitors:</w:t>
+      </w:r>
+    </w:p>
+    <w:p>
+      <w:pPr>
+        <w:rPr>
+          <w:b/>
+          <w:bCs/>
+        </w:rPr>
+      </w:pPr>
+      <w:r>
+        <w:rPr>
+          <w:b/>
+          <w:bCs/>
+        </w:rPr>
+        <w:t xml:space="preserve">Disabled </w:t>
+      </w:r>
+      <w:r>
+        <w:rPr>
+          <w:b/>
+          <w:bCs/>
+        </w:rPr>
+        <w:t>Visitors:</w:t>
       </w:r>
     </w:p>
     <w:p/>
@@ -808,7 +1315,7 @@
       <w:pPr>
         <w:pStyle w:val="Heading1"/>
         <w:sectPr>
-          <w:footerReference w:type="default" r:id="rId8"/>
+          <w:footerReference w:type="default" r:id="rId12"/>
           <w:pgSz w:w="11906" w:h="16838"/>
           <w:pgMar w:top="1440" w:right="1440" w:bottom="1440" w:left="1440" w:header="708" w:footer="708" w:gutter="0"/>
           <w:cols w:space="708"/>

</xml_diff>

<commit_message>
Created tables in DB
</commit_message>
<xml_diff>
--- a/documentation/George Cooke - Theatre Booking Documentation.docx
+++ b/documentation/George Cooke - Theatre Booking Documentation.docx
@@ -4627,7 +4627,7 @@
       <w:tr>
         <w:tc>
           <w:tcPr>
-            <w:tcW w:w="1861" w:type="dxa"/>
+            <w:tcW w:w="1242" w:type="dxa"/>
           </w:tcPr>
           <w:p>
             <w:pPr>
@@ -4651,7 +4651,7 @@
         </w:tc>
         <w:tc>
           <w:tcPr>
-            <w:tcW w:w="1555" w:type="dxa"/>
+            <w:tcW w:w="1661" w:type="dxa"/>
           </w:tcPr>
           <w:p>
             <w:pPr>
@@ -4671,7 +4671,7 @@
         </w:tc>
         <w:tc>
           <w:tcPr>
-            <w:tcW w:w="1765" w:type="dxa"/>
+            <w:tcW w:w="1220" w:type="dxa"/>
           </w:tcPr>
           <w:p>
             <w:pPr>
@@ -4691,7 +4691,7 @@
         </w:tc>
         <w:tc>
           <w:tcPr>
-            <w:tcW w:w="1813" w:type="dxa"/>
+            <w:tcW w:w="1567" w:type="dxa"/>
           </w:tcPr>
           <w:p>
             <w:pPr>
@@ -4711,7 +4711,7 @@
         </w:tc>
         <w:tc>
           <w:tcPr>
-            <w:tcW w:w="2022" w:type="dxa"/>
+            <w:tcW w:w="3326" w:type="dxa"/>
           </w:tcPr>
           <w:p>
             <w:pPr>
@@ -4733,7 +4733,7 @@
       <w:tr>
         <w:tc>
           <w:tcPr>
-            <w:tcW w:w="1861" w:type="dxa"/>
+            <w:tcW w:w="1242" w:type="dxa"/>
           </w:tcPr>
           <w:p>
             <w:r>
@@ -4743,7 +4743,7 @@
         </w:tc>
         <w:tc>
           <w:tcPr>
-            <w:tcW w:w="1555" w:type="dxa"/>
+            <w:tcW w:w="1661" w:type="dxa"/>
           </w:tcPr>
           <w:p>
             <w:r>
@@ -4753,7 +4753,7 @@
         </w:tc>
         <w:tc>
           <w:tcPr>
-            <w:tcW w:w="1765" w:type="dxa"/>
+            <w:tcW w:w="1220" w:type="dxa"/>
           </w:tcPr>
           <w:p>
             <w:r>
@@ -4763,7 +4763,7 @@
         </w:tc>
         <w:tc>
           <w:tcPr>
-            <w:tcW w:w="1813" w:type="dxa"/>
+            <w:tcW w:w="1567" w:type="dxa"/>
           </w:tcPr>
           <w:p>
             <w:r>
@@ -4773,7 +4773,7 @@
         </w:tc>
         <w:tc>
           <w:tcPr>
-            <w:tcW w:w="2022" w:type="dxa"/>
+            <w:tcW w:w="3326" w:type="dxa"/>
           </w:tcPr>
           <w:p>
             <w:r>
@@ -4795,7 +4795,7 @@
       <w:tr>
         <w:tc>
           <w:tcPr>
-            <w:tcW w:w="1861" w:type="dxa"/>
+            <w:tcW w:w="1242" w:type="dxa"/>
           </w:tcPr>
           <w:p>
             <w:r>
@@ -4805,7 +4805,7 @@
         </w:tc>
         <w:tc>
           <w:tcPr>
-            <w:tcW w:w="1555" w:type="dxa"/>
+            <w:tcW w:w="1661" w:type="dxa"/>
           </w:tcPr>
           <w:p>
             <w:r>
@@ -4815,7 +4815,7 @@
         </w:tc>
         <w:tc>
           <w:tcPr>
-            <w:tcW w:w="1765" w:type="dxa"/>
+            <w:tcW w:w="1220" w:type="dxa"/>
           </w:tcPr>
           <w:p>
             <w:r>
@@ -4825,7 +4825,7 @@
         </w:tc>
         <w:tc>
           <w:tcPr>
-            <w:tcW w:w="1813" w:type="dxa"/>
+            <w:tcW w:w="1567" w:type="dxa"/>
           </w:tcPr>
           <w:p>
             <w:r>
@@ -4841,7 +4841,7 @@
         </w:tc>
         <w:tc>
           <w:tcPr>
-            <w:tcW w:w="2022" w:type="dxa"/>
+            <w:tcW w:w="3326" w:type="dxa"/>
           </w:tcPr>
           <w:p>
             <w:r>
@@ -4863,7 +4863,7 @@
       <w:tr>
         <w:tc>
           <w:tcPr>
-            <w:tcW w:w="1861" w:type="dxa"/>
+            <w:tcW w:w="1242" w:type="dxa"/>
           </w:tcPr>
           <w:p>
             <w:r>
@@ -4873,7 +4873,7 @@
         </w:tc>
         <w:tc>
           <w:tcPr>
-            <w:tcW w:w="1555" w:type="dxa"/>
+            <w:tcW w:w="1661" w:type="dxa"/>
           </w:tcPr>
           <w:p>
             <w:r>
@@ -4883,7 +4883,7 @@
         </w:tc>
         <w:tc>
           <w:tcPr>
-            <w:tcW w:w="1765" w:type="dxa"/>
+            <w:tcW w:w="1220" w:type="dxa"/>
           </w:tcPr>
           <w:p>
             <w:r>
@@ -4893,7 +4893,7 @@
         </w:tc>
         <w:tc>
           <w:tcPr>
-            <w:tcW w:w="1813" w:type="dxa"/>
+            <w:tcW w:w="1567" w:type="dxa"/>
           </w:tcPr>
           <w:p>
             <w:r>
@@ -4909,7 +4909,7 @@
         </w:tc>
         <w:tc>
           <w:tcPr>
-            <w:tcW w:w="2022" w:type="dxa"/>
+            <w:tcW w:w="3326" w:type="dxa"/>
           </w:tcPr>
           <w:p>
             <w:r>
@@ -4931,7 +4931,7 @@
       <w:tr>
         <w:tc>
           <w:tcPr>
-            <w:tcW w:w="1861" w:type="dxa"/>
+            <w:tcW w:w="1242" w:type="dxa"/>
           </w:tcPr>
           <w:p>
             <w:r>
@@ -4941,7 +4941,7 @@
         </w:tc>
         <w:tc>
           <w:tcPr>
-            <w:tcW w:w="1555" w:type="dxa"/>
+            <w:tcW w:w="1661" w:type="dxa"/>
           </w:tcPr>
           <w:p>
             <w:r>
@@ -4951,7 +4951,7 @@
         </w:tc>
         <w:tc>
           <w:tcPr>
-            <w:tcW w:w="1765" w:type="dxa"/>
+            <w:tcW w:w="1220" w:type="dxa"/>
           </w:tcPr>
           <w:p>
             <w:r>
@@ -4961,7 +4961,7 @@
         </w:tc>
         <w:tc>
           <w:tcPr>
-            <w:tcW w:w="1813" w:type="dxa"/>
+            <w:tcW w:w="1567" w:type="dxa"/>
           </w:tcPr>
           <w:p>
             <w:r>
@@ -4977,7 +4977,7 @@
         </w:tc>
         <w:tc>
           <w:tcPr>
-            <w:tcW w:w="2022" w:type="dxa"/>
+            <w:tcW w:w="3326" w:type="dxa"/>
           </w:tcPr>
           <w:p>
             <w:hyperlink r:id="rId29" w:history="1">
@@ -5009,7 +5009,7 @@
       <w:tr>
         <w:tc>
           <w:tcPr>
-            <w:tcW w:w="1861" w:type="dxa"/>
+            <w:tcW w:w="1242" w:type="dxa"/>
           </w:tcPr>
           <w:p>
             <w:r>
@@ -5019,7 +5019,7 @@
         </w:tc>
         <w:tc>
           <w:tcPr>
-            <w:tcW w:w="1555" w:type="dxa"/>
+            <w:tcW w:w="1661" w:type="dxa"/>
           </w:tcPr>
           <w:p>
             <w:r>
@@ -5029,7 +5029,7 @@
         </w:tc>
         <w:tc>
           <w:tcPr>
-            <w:tcW w:w="1765" w:type="dxa"/>
+            <w:tcW w:w="1220" w:type="dxa"/>
           </w:tcPr>
           <w:p>
             <w:r>
@@ -5039,7 +5039,7 @@
         </w:tc>
         <w:tc>
           <w:tcPr>
-            <w:tcW w:w="1813" w:type="dxa"/>
+            <w:tcW w:w="1567" w:type="dxa"/>
           </w:tcPr>
           <w:p>
             <w:r>
@@ -5049,7 +5049,7 @@
         </w:tc>
         <w:tc>
           <w:tcPr>
-            <w:tcW w:w="2022" w:type="dxa"/>
+            <w:tcW w:w="3326" w:type="dxa"/>
           </w:tcPr>
           <w:p>
             <w:r>
@@ -5071,7 +5071,7 @@
       <w:tr>
         <w:tc>
           <w:tcPr>
-            <w:tcW w:w="1861" w:type="dxa"/>
+            <w:tcW w:w="1242" w:type="dxa"/>
           </w:tcPr>
           <w:p>
             <w:r>
@@ -5081,7 +5081,7 @@
         </w:tc>
         <w:tc>
           <w:tcPr>
-            <w:tcW w:w="1555" w:type="dxa"/>
+            <w:tcW w:w="1661" w:type="dxa"/>
           </w:tcPr>
           <w:p>
             <w:r>
@@ -5094,7 +5094,7 @@
         </w:tc>
         <w:tc>
           <w:tcPr>
-            <w:tcW w:w="1765" w:type="dxa"/>
+            <w:tcW w:w="1220" w:type="dxa"/>
           </w:tcPr>
           <w:p>
             <w:r>
@@ -5104,7 +5104,7 @@
         </w:tc>
         <w:tc>
           <w:tcPr>
-            <w:tcW w:w="1813" w:type="dxa"/>
+            <w:tcW w:w="1567" w:type="dxa"/>
           </w:tcPr>
           <w:p>
             <w:r>
@@ -5114,7 +5114,7 @@
         </w:tc>
         <w:tc>
           <w:tcPr>
-            <w:tcW w:w="2022" w:type="dxa"/>
+            <w:tcW w:w="3326" w:type="dxa"/>
           </w:tcPr>
           <w:p>
             <w:r>
@@ -5135,6 +5135,70 @@
           <w:p>
             <w:r>
               <w:t>07744 456892</w:t>
+            </w:r>
+          </w:p>
+        </w:tc>
+      </w:tr>
+      <w:tr>
+        <w:tc>
+          <w:tcPr>
+            <w:tcW w:w="1242" w:type="dxa"/>
+          </w:tcPr>
+          <w:p>
+            <w:r>
+              <w:t>userType</w:t>
+            </w:r>
+          </w:p>
+        </w:tc>
+        <w:tc>
+          <w:tcPr>
+            <w:tcW w:w="1661" w:type="dxa"/>
+          </w:tcPr>
+          <w:p>
+            <w:r>
+              <w:t>VARCHAR</w:t>
+            </w:r>
+            <w:r>
+              <w:t>(</w:t>
+            </w:r>
+          </w:p>
+        </w:tc>
+        <w:tc>
+          <w:tcPr>
+            <w:tcW w:w="1220" w:type="dxa"/>
+          </w:tcPr>
+          <w:p>
+            <w:r>
+              <w:t>The type of user (admin, special guest, visitor)</w:t>
+            </w:r>
+          </w:p>
+        </w:tc>
+        <w:tc>
+          <w:tcPr>
+            <w:tcW w:w="1567" w:type="dxa"/>
+          </w:tcPr>
+          <w:p>
+            <w:r>
+              <w:t>Is passed in by buttons so none needed</w:t>
+            </w:r>
+          </w:p>
+        </w:tc>
+        <w:tc>
+          <w:tcPr>
+            <w:tcW w:w="3326" w:type="dxa"/>
+          </w:tcPr>
+          <w:p>
+            <w:r>
+              <w:t>VISITOR</w:t>
+            </w:r>
+          </w:p>
+          <w:p>
+            <w:r>
+              <w:t>ADMIN</w:t>
+            </w:r>
+            <w:r>
+              <w:br/>
+              <w:t>SPECIAL</w:t>
             </w:r>
           </w:p>
         </w:tc>
@@ -5337,6 +5401,7 @@
           </w:tcPr>
           <w:p>
             <w:r>
+              <w:lastRenderedPageBreak/>
               <w:t>ShowingID</w:t>
             </w:r>
           </w:p>
@@ -5399,7 +5464,6 @@
           </w:tcPr>
           <w:p>
             <w:r>
-              <w:lastRenderedPageBreak/>
               <w:t>UserID</w:t>
             </w:r>
           </w:p>
@@ -5962,7 +6026,10 @@
           </w:tcPr>
           <w:p>
             <w:r>
-              <w:t>type</w:t>
+              <w:t>bookingT</w:t>
+            </w:r>
+            <w:r>
+              <w:t>ype</w:t>
             </w:r>
           </w:p>
         </w:tc>
@@ -6062,11 +6129,11 @@
         <w:tblLook w:val="04A0" w:firstRow="1" w:lastRow="0" w:firstColumn="1" w:lastColumn="0" w:noHBand="0" w:noVBand="1"/>
       </w:tblPr>
       <w:tblGrid>
-        <w:gridCol w:w="1840"/>
+        <w:gridCol w:w="2553"/>
         <w:gridCol w:w="1733"/>
-        <w:gridCol w:w="1732"/>
-        <w:gridCol w:w="1785"/>
-        <w:gridCol w:w="1926"/>
+        <w:gridCol w:w="1583"/>
+        <w:gridCol w:w="1654"/>
+        <w:gridCol w:w="1493"/>
       </w:tblGrid>
       <w:tr>
         <w:tc>
@@ -6299,6 +6366,7 @@
           </w:p>
           <w:p>
             <w:r>
+              <w:lastRenderedPageBreak/>
               <w:t>Star Wars:</w:t>
             </w:r>
             <w:r>
@@ -6317,7 +6385,8 @@
           </w:tcPr>
           <w:p>
             <w:r>
-              <w:t>d</w:t>
+              <w:lastRenderedPageBreak/>
+              <w:t>performanceD</w:t>
             </w:r>
             <w:r>
               <w:t>escription</w:t>
@@ -6372,7 +6441,6 @@
           </w:tcPr>
           <w:p>
             <w:r>
-              <w:lastRenderedPageBreak/>
               <w:t>childPrice</w:t>
             </w:r>
           </w:p>
@@ -7096,8 +7164,11 @@
       </w:tr>
     </w:tbl>
     <w:p/>
-    <w:p>
-      <w:r>
+    <w:p/>
+    <w:p/>
+    <w:p>
+      <w:r>
+        <w:lastRenderedPageBreak/>
         <w:t>Showings</w:t>
       </w:r>
     </w:p>
@@ -7309,11 +7380,7 @@
           </w:tcPr>
           <w:p>
             <w:r>
-              <w:t xml:space="preserve">Unique identifier for every performance </w:t>
-            </w:r>
-            <w:r>
-              <w:lastRenderedPageBreak/>
-              <w:t>to show the performance the showing is for</w:t>
+              <w:t>Unique identifier for every performance to show the performance the showing is for</w:t>
             </w:r>
           </w:p>
         </w:tc>
@@ -7323,7 +7390,6 @@
           </w:tcPr>
           <w:p>
             <w:r>
-              <w:lastRenderedPageBreak/>
               <w:t>Automatically generated</w:t>
             </w:r>
           </w:p>
@@ -7356,7 +7422,10 @@
           </w:tcPr>
           <w:p>
             <w:r>
-              <w:t>date</w:t>
+              <w:t>showingD</w:t>
+            </w:r>
+            <w:r>
+              <w:t>ate</w:t>
             </w:r>
           </w:p>
         </w:tc>
@@ -7692,6 +7761,7 @@
           <w:b/>
           <w:bCs/>
         </w:rPr>
+        <w:lastRenderedPageBreak/>
         <w:t>User Portal</w:t>
       </w:r>
     </w:p>
@@ -7803,7 +7873,6 @@
         </w:numPr>
       </w:pPr>
       <w:r>
-        <w:lastRenderedPageBreak/>
         <w:t>Select seats,</w:t>
       </w:r>
     </w:p>
@@ -8176,6 +8245,7 @@
         </w:numPr>
       </w:pPr>
       <w:r>
+        <w:lastRenderedPageBreak/>
         <w:t>Add showings to event,</w:t>
       </w:r>
     </w:p>
@@ -8296,7 +8366,6 @@
         </w:numPr>
       </w:pPr>
       <w:r>
-        <w:lastRenderedPageBreak/>
         <w:t>Get date,</w:t>
       </w:r>
     </w:p>
@@ -11584,7 +11653,6 @@
         <w:docPartUnique/>
       </w:docPartObj>
     </w:sdtPr>
-    <w:sdtEndPr/>
     <w:sdtContent>
       <w:p>
         <w:pPr>

</xml_diff>

<commit_message>
Implemented get booking price
</commit_message>
<xml_diff>
--- a/documentation/George Cooke - Theatre Booking Documentation.docx
+++ b/documentation/George Cooke - Theatre Booking Documentation.docx
@@ -766,10 +766,18 @@
     </w:p>
     <w:p>
       <w:r>
-        <w:t xml:space="preserve">There are a multitude of different booking apps used around the world for all different purposes. Some are to book tickets to films, other for music festivals, some for sports, and some for </w:t>
-      </w:r>
-      <w:r>
-        <w:t>aircraft seats</w:t>
+        <w:t xml:space="preserve">There are a multitude of different booking apps used around the world for all different purposes. Some are to book tickets to films, other for music festivals, some for sports, and some </w:t>
+      </w:r>
+      <w:proofErr w:type="gramStart"/>
+      <w:r>
+        <w:t xml:space="preserve">for </w:t>
+      </w:r>
+      <w:r>
+        <w:t>aircraft</w:t>
+      </w:r>
+      <w:proofErr w:type="gramEnd"/>
+      <w:r>
+        <w:t xml:space="preserve"> seats</w:t>
       </w:r>
       <w:r>
         <w:t xml:space="preserve">. </w:t>
@@ -897,7 +905,15 @@
         <w:t xml:space="preserve"> I will likely replace this page with a custom one</w:t>
       </w:r>
       <w:r>
-        <w:t xml:space="preserve"> of my own design with just a number of simple buttons each with the date that they represent.</w:t>
+        <w:t xml:space="preserve"> of my own design with just </w:t>
+      </w:r>
+      <w:proofErr w:type="gramStart"/>
+      <w:r>
+        <w:t>a number of</w:t>
+      </w:r>
+      <w:proofErr w:type="gramEnd"/>
+      <w:r>
+        <w:t xml:space="preserve"> simple buttons each with the date that they represent.</w:t>
       </w:r>
     </w:p>
     <w:p>
@@ -1498,7 +1514,15 @@
         <w:t xml:space="preserve">As such, it will be important </w:t>
       </w:r>
       <w:r>
-        <w:t>for seats to be blocked off for these purposes by admin staff so that the general public cannot buy specific seats.</w:t>
+        <w:t xml:space="preserve">for seats to be blocked off for these purposes by admin staff so that the </w:t>
+      </w:r>
+      <w:proofErr w:type="gramStart"/>
+      <w:r>
+        <w:t>general public</w:t>
+      </w:r>
+      <w:proofErr w:type="gramEnd"/>
+      <w:r>
+        <w:t xml:space="preserve"> cannot buy specific seats.</w:t>
       </w:r>
     </w:p>
     <w:p/>
@@ -1668,7 +1692,15 @@
         <w:t xml:space="preserve"> copy and comparing the name to the people attending. While the names will be sorted alphabetically by surname, it could be helpful to have search functionality.</w:t>
       </w:r>
       <w:r>
-        <w:t xml:space="preserve"> That being said, it is not necessary as they will be able to go through </w:t>
+        <w:t xml:space="preserve"> </w:t>
+      </w:r>
+      <w:proofErr w:type="gramStart"/>
+      <w:r>
+        <w:t>That being said, it</w:t>
+      </w:r>
+      <w:proofErr w:type="gramEnd"/>
+      <w:r>
+        <w:t xml:space="preserve"> is not necessary as they will be able to go through </w:t>
       </w:r>
       <w:r>
         <w:t xml:space="preserve">the names by alphabetical order. Furthermore, many events do not check tickets against their platform and instead opt to take tickets as what they appear to be. As such, </w:t>
@@ -1680,7 +1712,15 @@
     <w:p>
       <w:r>
         <w:tab/>
-        <w:t>It could also be helpful to admin staff to be able to book tickets themselves for other people. This would be similar to staff at cinemas being able to buy you a ticket</w:t>
+        <w:t xml:space="preserve">It could also be helpful to admin staff to be able to book tickets themselves for other people. This would be </w:t>
+      </w:r>
+      <w:proofErr w:type="gramStart"/>
+      <w:r>
+        <w:t>similar to</w:t>
+      </w:r>
+      <w:proofErr w:type="gramEnd"/>
+      <w:r>
+        <w:t xml:space="preserve"> staff at cinemas being able to buy you a ticket</w:t>
       </w:r>
       <w:r>
         <w:t>. This would not be possible with the current system. The main demographic that would find this helpful would be the elderly</w:t>
@@ -1703,8 +1743,13 @@
       <w:r>
         <w:t xml:space="preserve">Furthermore, the elderly can be seen (from a business point of view) as a less valuable customer on account of their reduced ticket price. As such, it would not be economical to go to such great lengths to accommodate them. </w:t>
       </w:r>
-      <w:r>
-        <w:t>That being said, it would help to reduce the digital divide and build a more accommodating society.</w:t>
+      <w:proofErr w:type="gramStart"/>
+      <w:r>
+        <w:t>That being said, it</w:t>
+      </w:r>
+      <w:proofErr w:type="gramEnd"/>
+      <w:r>
+        <w:t xml:space="preserve"> would help to reduce the digital divide and build a more accommodating society.</w:t>
       </w:r>
       <w:r>
         <w:t xml:space="preserve"> Ultimately, it would be beneficial to have the ability for admin staff to be able to book seats </w:t>
@@ -1732,7 +1777,23 @@
     <w:p>
       <w:r>
         <w:lastRenderedPageBreak/>
-        <w:t xml:space="preserve">Visitors make up the majority of the user base for this program </w:t>
+        <w:t xml:space="preserve">Visitors make up </w:t>
+      </w:r>
+      <w:proofErr w:type="gramStart"/>
+      <w:r>
+        <w:t>the majority of</w:t>
+      </w:r>
+      <w:proofErr w:type="gramEnd"/>
+      <w:r>
+        <w:t xml:space="preserve"> the user base for this </w:t>
+      </w:r>
+      <w:proofErr w:type="gramStart"/>
+      <w:r>
+        <w:t>program</w:t>
+      </w:r>
+      <w:proofErr w:type="gramEnd"/>
+      <w:r>
+        <w:t xml:space="preserve"> </w:t>
       </w:r>
       <w:r>
         <w:t>and their side of the systems will need the most attention as a result. Visitors should be assumed to be new to the platform and will therefore need more instructions and directions for what to do compared to admin staff that would have experience and training in the software.</w:t>
@@ -1815,10 +1876,26 @@
     </w:p>
     <w:p>
       <w:r>
-        <w:t xml:space="preserve">While this is the most critical part of the system, it is also the most intuitive owing to </w:t>
-      </w:r>
-      <w:r>
-        <w:t xml:space="preserve">the fact that everyone (myself included) has had extensive experience with them. This will mean that I can draw inspiration from other similar systems (see above) and draw on users’ </w:t>
+        <w:t xml:space="preserve">While this is the most critical part of the system, it is also the most intuitive </w:t>
+      </w:r>
+      <w:proofErr w:type="gramStart"/>
+      <w:r>
+        <w:t xml:space="preserve">owing to </w:t>
+      </w:r>
+      <w:r>
+        <w:t>the fact that</w:t>
+      </w:r>
+      <w:proofErr w:type="gramEnd"/>
+      <w:r>
+        <w:t xml:space="preserve"> everyone (</w:t>
+      </w:r>
+      <w:proofErr w:type="gramStart"/>
+      <w:r>
+        <w:t>myself</w:t>
+      </w:r>
+      <w:proofErr w:type="gramEnd"/>
+      <w:r>
+        <w:t xml:space="preserve"> included) has had extensive experience with them. This will mean that I can draw inspiration from other similar systems (see above) and draw on users’ </w:t>
       </w:r>
       <w:r>
         <w:t>knowledge on how to use them to reduce the need for instruction.</w:t>
@@ -1859,7 +1936,23 @@
         <w:t xml:space="preserve">While the disabled community makes up a small percentage of the British population </w:t>
       </w:r>
       <w:r>
-        <w:t xml:space="preserve">(approximately 4.9% of the British population have blue badges), Collyer’s is a large institution and it would be reasonable to assume that it has a number of students and carers with disabilities that would require special allowances. </w:t>
+        <w:t xml:space="preserve">(approximately 4.9% of the British population have blue badges), Collyer’s is a large </w:t>
+      </w:r>
+      <w:proofErr w:type="gramStart"/>
+      <w:r>
+        <w:t>institution</w:t>
+      </w:r>
+      <w:proofErr w:type="gramEnd"/>
+      <w:r>
+        <w:t xml:space="preserve"> and it would be reasonable to assume that it has </w:t>
+      </w:r>
+      <w:proofErr w:type="gramStart"/>
+      <w:r>
+        <w:t>a number of</w:t>
+      </w:r>
+      <w:proofErr w:type="gramEnd"/>
+      <w:r>
+        <w:t xml:space="preserve"> students and carers with disabilities that would require special allowances. </w:t>
       </w:r>
       <w:r>
         <w:t>There is little that the system itself would need to do to accommodate for these people as the bulk of that responsibility falls on the event organisers.</w:t>
@@ -2409,10 +2502,34 @@
         <w:t xml:space="preserve">I will be making use of Flask for my </w:t>
       </w:r>
       <w:r>
-        <w:t>application. This is both because it is more realistic to what a client would want with it enabling users to book online from anywhere but also because I think it is the best option for me. I am inexperienced with PyQt and would rather keep my distance from it</w:t>
-      </w:r>
-      <w:r>
-        <w:t>. I would be open to using tkinter or custom tkinter but I believe that there would be great performance issues on the booking page as it has to render 200 different seats. As a result, I believe that a web page is the most appropriate choice.</w:t>
+        <w:t xml:space="preserve">application. This is both because it is more realistic to what a client would want with it enabling users to book online from anywhere but also because I think it is the best option for me. I am inexperienced with </w:t>
+      </w:r>
+      <w:proofErr w:type="spellStart"/>
+      <w:r>
+        <w:t>PyQt</w:t>
+      </w:r>
+      <w:proofErr w:type="spellEnd"/>
+      <w:r>
+        <w:t xml:space="preserve"> and would rather keep my distance from it</w:t>
+      </w:r>
+      <w:r>
+        <w:t xml:space="preserve">. I would be open to using tkinter or custom </w:t>
+      </w:r>
+      <w:proofErr w:type="gramStart"/>
+      <w:r>
+        <w:t>tkinter</w:t>
+      </w:r>
+      <w:proofErr w:type="gramEnd"/>
+      <w:r>
+        <w:t xml:space="preserve"> but I believe that there would be great performance issues on the booking page as it </w:t>
+      </w:r>
+      <w:proofErr w:type="gramStart"/>
+      <w:r>
+        <w:t>has to</w:t>
+      </w:r>
+      <w:proofErr w:type="gramEnd"/>
+      <w:r>
+        <w:t xml:space="preserve"> render 200 different seats. As a result, I believe that a web page is the most appropriate choice.</w:t>
       </w:r>
     </w:p>
     <w:p>
@@ -2710,7 +2827,15 @@
         <w:t xml:space="preserve"> that I am most used to interacting with and I will thus be better equipped to visualise what a user would expect </w:t>
       </w:r>
       <w:r>
-        <w:t>through this medium. I will then go on to use this as a tool to help me make flow charts and diagrams explaining all of the different subroutines I will need to make.</w:t>
+        <w:t xml:space="preserve">through this medium. I will then go on to use this as a tool to help me make flow charts and diagrams explaining </w:t>
+      </w:r>
+      <w:proofErr w:type="gramStart"/>
+      <w:r>
+        <w:t>all of</w:t>
+      </w:r>
+      <w:proofErr w:type="gramEnd"/>
+      <w:r>
+        <w:t xml:space="preserve"> the different subroutines I will need to make.</w:t>
       </w:r>
     </w:p>
     <w:p>
@@ -4736,9 +4861,11 @@
             <w:tcW w:w="1242" w:type="dxa"/>
           </w:tcPr>
           <w:p>
+            <w:proofErr w:type="spellStart"/>
             <w:r>
               <w:t>UserID</w:t>
             </w:r>
+            <w:proofErr w:type="spellEnd"/>
           </w:p>
         </w:tc>
         <w:tc>
@@ -4798,9 +4925,11 @@
             <w:tcW w:w="1242" w:type="dxa"/>
           </w:tcPr>
           <w:p>
+            <w:proofErr w:type="spellStart"/>
             <w:r>
               <w:t>firstName</w:t>
             </w:r>
+            <w:proofErr w:type="spellEnd"/>
           </w:p>
         </w:tc>
         <w:tc>
@@ -4808,8 +4937,13 @@
             <w:tcW w:w="1661" w:type="dxa"/>
           </w:tcPr>
           <w:p>
-            <w:r>
-              <w:t>VARCHAR(30)</w:t>
+            <w:proofErr w:type="gramStart"/>
+            <w:r>
+              <w:t>VARCHAR(</w:t>
+            </w:r>
+            <w:proofErr w:type="gramEnd"/>
+            <w:r>
+              <w:t>30)</w:t>
             </w:r>
           </w:p>
         </w:tc>
@@ -4866,9 +5000,11 @@
             <w:tcW w:w="1242" w:type="dxa"/>
           </w:tcPr>
           <w:p>
+            <w:proofErr w:type="spellStart"/>
             <w:r>
               <w:t>lastname</w:t>
             </w:r>
+            <w:proofErr w:type="spellEnd"/>
           </w:p>
         </w:tc>
         <w:tc>
@@ -4876,8 +5012,13 @@
             <w:tcW w:w="1661" w:type="dxa"/>
           </w:tcPr>
           <w:p>
-            <w:r>
-              <w:t>VARCHAR(30)</w:t>
+            <w:proofErr w:type="gramStart"/>
+            <w:r>
+              <w:t>VARCHAR(</w:t>
+            </w:r>
+            <w:proofErr w:type="gramEnd"/>
+            <w:r>
+              <w:t>30)</w:t>
             </w:r>
           </w:p>
         </w:tc>
@@ -4944,8 +5085,13 @@
             <w:tcW w:w="1661" w:type="dxa"/>
           </w:tcPr>
           <w:p>
-            <w:r>
-              <w:t>VARCHAR(100)</w:t>
+            <w:proofErr w:type="gramStart"/>
+            <w:r>
+              <w:t>VARCHAR(</w:t>
+            </w:r>
+            <w:proofErr w:type="gramEnd"/>
+            <w:r>
+              <w:t>100)</w:t>
             </w:r>
           </w:p>
         </w:tc>
@@ -5022,8 +5168,13 @@
             <w:tcW w:w="1661" w:type="dxa"/>
           </w:tcPr>
           <w:p>
-            <w:r>
-              <w:t>VARCHAR(50)</w:t>
+            <w:proofErr w:type="gramStart"/>
+            <w:r>
+              <w:t>VARCHAR(</w:t>
+            </w:r>
+            <w:proofErr w:type="gramEnd"/>
+            <w:r>
+              <w:t>50)</w:t>
             </w:r>
           </w:p>
         </w:tc>
@@ -5062,9 +5213,11 @@
             </w:r>
           </w:p>
           <w:p>
+            <w:proofErr w:type="spellStart"/>
             <w:r>
               <w:t>avjbiluahgl</w:t>
             </w:r>
+            <w:proofErr w:type="spellEnd"/>
           </w:p>
         </w:tc>
       </w:tr>
@@ -5084,9 +5237,11 @@
             <w:tcW w:w="1661" w:type="dxa"/>
           </w:tcPr>
           <w:p>
+            <w:proofErr w:type="gramStart"/>
             <w:r>
               <w:t>VARCHAR(</w:t>
             </w:r>
+            <w:proofErr w:type="gramEnd"/>
             <w:r>
               <w:t>16)</w:t>
             </w:r>
@@ -5145,9 +5300,11 @@
             <w:tcW w:w="1242" w:type="dxa"/>
           </w:tcPr>
           <w:p>
+            <w:proofErr w:type="spellStart"/>
             <w:r>
               <w:t>userType</w:t>
             </w:r>
+            <w:proofErr w:type="spellEnd"/>
           </w:p>
         </w:tc>
         <w:tc>
@@ -5155,12 +5312,14 @@
             <w:tcW w:w="1661" w:type="dxa"/>
           </w:tcPr>
           <w:p>
+            <w:proofErr w:type="gramStart"/>
             <w:r>
               <w:t>VARCHAR</w:t>
             </w:r>
             <w:r>
               <w:t>(</w:t>
             </w:r>
+            <w:proofErr w:type="gramEnd"/>
           </w:p>
         </w:tc>
         <w:tc>
@@ -5335,9 +5494,11 @@
             <w:tcW w:w="1861" w:type="dxa"/>
           </w:tcPr>
           <w:p>
+            <w:proofErr w:type="spellStart"/>
             <w:r>
               <w:t>BookingID</w:t>
             </w:r>
+            <w:proofErr w:type="spellEnd"/>
           </w:p>
         </w:tc>
         <w:tc>
@@ -5400,10 +5561,12 @@
             <w:tcW w:w="1861" w:type="dxa"/>
           </w:tcPr>
           <w:p>
+            <w:proofErr w:type="spellStart"/>
             <w:r>
               <w:lastRenderedPageBreak/>
               <w:t>ShowingID</w:t>
             </w:r>
+            <w:proofErr w:type="spellEnd"/>
           </w:p>
         </w:tc>
         <w:tc>
@@ -5463,9 +5626,11 @@
             <w:tcW w:w="1861" w:type="dxa"/>
           </w:tcPr>
           <w:p>
+            <w:proofErr w:type="spellStart"/>
             <w:r>
               <w:t>UserID</w:t>
             </w:r>
+            <w:proofErr w:type="spellEnd"/>
           </w:p>
         </w:tc>
         <w:tc>
@@ -5697,9 +5862,11 @@
             <w:pPr>
               <w:spacing w:after="160" w:line="278" w:lineRule="auto"/>
             </w:pPr>
+            <w:proofErr w:type="spellStart"/>
             <w:r>
               <w:t>BookingSeatID</w:t>
             </w:r>
+            <w:proofErr w:type="spellEnd"/>
           </w:p>
         </w:tc>
         <w:tc>
@@ -5814,9 +5981,11 @@
             </w:tcBorders>
           </w:tcPr>
           <w:p>
+            <w:proofErr w:type="spellStart"/>
             <w:r>
               <w:t>BookingID</w:t>
             </w:r>
+            <w:proofErr w:type="spellEnd"/>
           </w:p>
         </w:tc>
         <w:tc>
@@ -5915,9 +6084,11 @@
             </w:tcBorders>
           </w:tcPr>
           <w:p>
+            <w:proofErr w:type="spellStart"/>
             <w:r>
               <w:t>SeatID</w:t>
             </w:r>
+            <w:proofErr w:type="spellEnd"/>
           </w:p>
         </w:tc>
         <w:tc>
@@ -5931,9 +6102,11 @@
             </w:tcBorders>
           </w:tcPr>
           <w:p>
+            <w:proofErr w:type="gramStart"/>
             <w:r>
               <w:t>VARCHAR(</w:t>
             </w:r>
+            <w:proofErr w:type="gramEnd"/>
             <w:r>
               <w:t>3</w:t>
             </w:r>
@@ -6025,12 +6198,14 @@
             </w:tcBorders>
           </w:tcPr>
           <w:p>
+            <w:proofErr w:type="spellStart"/>
             <w:r>
               <w:t>bookingT</w:t>
             </w:r>
             <w:r>
               <w:t>ype</w:t>
             </w:r>
+            <w:proofErr w:type="spellEnd"/>
           </w:p>
         </w:tc>
         <w:tc>
@@ -6044,9 +6219,11 @@
             </w:tcBorders>
           </w:tcPr>
           <w:p>
+            <w:proofErr w:type="gramStart"/>
             <w:r>
               <w:t>VARCHAR(</w:t>
             </w:r>
+            <w:proofErr w:type="gramEnd"/>
             <w:r>
               <w:t>7</w:t>
             </w:r>
@@ -6247,9 +6424,11 @@
             <w:tcW w:w="1840" w:type="dxa"/>
           </w:tcPr>
           <w:p>
+            <w:proofErr w:type="spellStart"/>
             <w:r>
               <w:t>PerformanceID</w:t>
             </w:r>
+            <w:proofErr w:type="spellEnd"/>
           </w:p>
         </w:tc>
         <w:tc>
@@ -6319,8 +6498,13 @@
             <w:tcW w:w="1733" w:type="dxa"/>
           </w:tcPr>
           <w:p>
-            <w:r>
-              <w:t>VARCHAR(100)</w:t>
+            <w:proofErr w:type="gramStart"/>
+            <w:r>
+              <w:t>VARCHAR(</w:t>
+            </w:r>
+            <w:proofErr w:type="gramEnd"/>
+            <w:r>
+              <w:t>100)</w:t>
             </w:r>
           </w:p>
         </w:tc>
@@ -6384,6 +6568,7 @@
             <w:tcW w:w="1840" w:type="dxa"/>
           </w:tcPr>
           <w:p>
+            <w:proofErr w:type="spellStart"/>
             <w:r>
               <w:lastRenderedPageBreak/>
               <w:t>performanceD</w:t>
@@ -6391,6 +6576,7 @@
             <w:r>
               <w:t>escription</w:t>
             </w:r>
+            <w:proofErr w:type="spellEnd"/>
           </w:p>
         </w:tc>
         <w:tc>
@@ -6440,9 +6626,11 @@
             <w:tcW w:w="1840" w:type="dxa"/>
           </w:tcPr>
           <w:p>
+            <w:proofErr w:type="spellStart"/>
             <w:r>
               <w:t>childPrice</w:t>
             </w:r>
+            <w:proofErr w:type="spellEnd"/>
           </w:p>
         </w:tc>
         <w:tc>
@@ -6450,8 +6638,13 @@
             <w:tcW w:w="1733" w:type="dxa"/>
           </w:tcPr>
           <w:p>
-            <w:r>
-              <w:t>DECIMAL(2)</w:t>
+            <w:proofErr w:type="gramStart"/>
+            <w:r>
+              <w:t>DECIMAL(</w:t>
+            </w:r>
+            <w:proofErr w:type="gramEnd"/>
+            <w:r>
+              <w:t>2)</w:t>
             </w:r>
           </w:p>
         </w:tc>
@@ -6502,9 +6695,11 @@
             <w:tcW w:w="1840" w:type="dxa"/>
           </w:tcPr>
           <w:p>
+            <w:proofErr w:type="spellStart"/>
             <w:r>
               <w:t>adultPrice</w:t>
             </w:r>
+            <w:proofErr w:type="spellEnd"/>
           </w:p>
         </w:tc>
         <w:tc>
@@ -6512,8 +6707,13 @@
             <w:tcW w:w="1733" w:type="dxa"/>
           </w:tcPr>
           <w:p>
-            <w:r>
-              <w:t>DECIMAL(2)</w:t>
+            <w:proofErr w:type="gramStart"/>
+            <w:r>
+              <w:t>DECIMAL(</w:t>
+            </w:r>
+            <w:proofErr w:type="gramEnd"/>
+            <w:r>
+              <w:t>2)</w:t>
             </w:r>
           </w:p>
         </w:tc>
@@ -6564,9 +6764,11 @@
             <w:tcW w:w="1840" w:type="dxa"/>
           </w:tcPr>
           <w:p>
+            <w:proofErr w:type="spellStart"/>
             <w:r>
               <w:t>elderlyPrice</w:t>
             </w:r>
+            <w:proofErr w:type="spellEnd"/>
           </w:p>
         </w:tc>
         <w:tc>
@@ -6574,8 +6776,13 @@
             <w:tcW w:w="1733" w:type="dxa"/>
           </w:tcPr>
           <w:p>
-            <w:r>
-              <w:t>DECIMAL(2)</w:t>
+            <w:proofErr w:type="gramStart"/>
+            <w:r>
+              <w:t>DECIMAL(</w:t>
+            </w:r>
+            <w:proofErr w:type="gramEnd"/>
+            <w:r>
+              <w:t>2)</w:t>
             </w:r>
           </w:p>
         </w:tc>
@@ -6764,12 +6971,14 @@
             <w:tcW w:w="3322" w:type="dxa"/>
           </w:tcPr>
           <w:p>
+            <w:proofErr w:type="spellStart"/>
             <w:r>
               <w:t>PerformanceUnavailableSeats</w:t>
             </w:r>
             <w:r>
               <w:t>ID</w:t>
             </w:r>
+            <w:proofErr w:type="spellEnd"/>
           </w:p>
         </w:tc>
         <w:tc>
@@ -6829,9 +7038,11 @@
             <w:tcW w:w="3322" w:type="dxa"/>
           </w:tcPr>
           <w:p>
+            <w:proofErr w:type="spellStart"/>
             <w:r>
               <w:t>PerformanceID</w:t>
             </w:r>
+            <w:proofErr w:type="spellEnd"/>
           </w:p>
         </w:tc>
         <w:tc>
@@ -6891,9 +7102,11 @@
             <w:tcW w:w="3322" w:type="dxa"/>
           </w:tcPr>
           <w:p>
+            <w:proofErr w:type="spellStart"/>
             <w:r>
               <w:t>SeatID</w:t>
             </w:r>
+            <w:proofErr w:type="spellEnd"/>
           </w:p>
         </w:tc>
         <w:tc>
@@ -6901,9 +7114,11 @@
             <w:tcW w:w="1101" w:type="dxa"/>
           </w:tcPr>
           <w:p>
+            <w:proofErr w:type="gramStart"/>
             <w:r>
               <w:t>VARCHAR(</w:t>
             </w:r>
+            <w:proofErr w:type="gramEnd"/>
             <w:r>
               <w:t>3</w:t>
             </w:r>
@@ -6920,12 +7135,14 @@
             <w:r>
               <w:t xml:space="preserve">Unique identifier for every </w:t>
             </w:r>
+            <w:proofErr w:type="gramStart"/>
             <w:r>
               <w:t xml:space="preserve">unavailable </w:t>
             </w:r>
             <w:r>
               <w:t xml:space="preserve"> seat</w:t>
             </w:r>
+            <w:proofErr w:type="gramEnd"/>
           </w:p>
         </w:tc>
         <w:tc>
@@ -7097,9 +7314,11 @@
             <w:tcW w:w="3322" w:type="dxa"/>
           </w:tcPr>
           <w:p>
+            <w:proofErr w:type="spellStart"/>
             <w:r>
               <w:t>SeatID</w:t>
             </w:r>
+            <w:proofErr w:type="spellEnd"/>
           </w:p>
         </w:tc>
         <w:tc>
@@ -7107,8 +7326,13 @@
             <w:tcW w:w="1101" w:type="dxa"/>
           </w:tcPr>
           <w:p>
-            <w:r>
-              <w:t>VARCHAR(3)</w:t>
+            <w:proofErr w:type="gramStart"/>
+            <w:r>
+              <w:t>VARCHAR(</w:t>
+            </w:r>
+            <w:proofErr w:type="gramEnd"/>
+            <w:r>
+              <w:t>3)</w:t>
             </w:r>
           </w:p>
         </w:tc>
@@ -7297,9 +7521,11 @@
             <w:tcW w:w="3322" w:type="dxa"/>
           </w:tcPr>
           <w:p>
+            <w:proofErr w:type="spellStart"/>
             <w:r>
               <w:t>ShowingID</w:t>
             </w:r>
+            <w:proofErr w:type="spellEnd"/>
           </w:p>
         </w:tc>
         <w:tc>
@@ -7359,9 +7585,11 @@
             <w:tcW w:w="3322" w:type="dxa"/>
           </w:tcPr>
           <w:p>
+            <w:proofErr w:type="spellStart"/>
             <w:r>
               <w:t>PerformanceID</w:t>
             </w:r>
+            <w:proofErr w:type="spellEnd"/>
           </w:p>
         </w:tc>
         <w:tc>
@@ -7421,12 +7649,14 @@
             <w:tcW w:w="3322" w:type="dxa"/>
           </w:tcPr>
           <w:p>
+            <w:proofErr w:type="spellStart"/>
             <w:r>
               <w:t>showingD</w:t>
             </w:r>
             <w:r>
               <w:t>ate</w:t>
             </w:r>
+            <w:proofErr w:type="spellEnd"/>
           </w:p>
         </w:tc>
         <w:tc>
@@ -9523,7 +9753,15 @@
           </w:tcPr>
           <w:p>
             <w:r>
-              <w:t>Top left (ish) of every visitor page</w:t>
+              <w:t>Top left (</w:t>
+            </w:r>
+            <w:proofErr w:type="spellStart"/>
+            <w:r>
+              <w:t>ish</w:t>
+            </w:r>
+            <w:proofErr w:type="spellEnd"/>
+            <w:r>
+              <w:t>) of every visitor page</w:t>
             </w:r>
           </w:p>
         </w:tc>
@@ -9614,7 +9852,15 @@
           </w:tcPr>
           <w:p>
             <w:r>
-              <w:t>To the left of every performance in the main visitors events page</w:t>
+              <w:t xml:space="preserve">To the left of every performance in the main </w:t>
+            </w:r>
+            <w:proofErr w:type="gramStart"/>
+            <w:r>
+              <w:t>visitors</w:t>
+            </w:r>
+            <w:proofErr w:type="gramEnd"/>
+            <w:r>
+              <w:t xml:space="preserve"> events page</w:t>
             </w:r>
           </w:p>
         </w:tc>
@@ -9649,7 +9895,15 @@
           </w:tcPr>
           <w:p>
             <w:r>
-              <w:t>Date select button(s)</w:t>
+              <w:t xml:space="preserve">Date </w:t>
+            </w:r>
+            <w:proofErr w:type="gramStart"/>
+            <w:r>
+              <w:t>select</w:t>
+            </w:r>
+            <w:proofErr w:type="gramEnd"/>
+            <w:r>
+              <w:t xml:space="preserve"> button(s)</w:t>
             </w:r>
           </w:p>
         </w:tc>
@@ -9954,7 +10208,15 @@
           </w:tcPr>
           <w:p>
             <w:r>
-              <w:t xml:space="preserve">Checks number of seats selected and seat type numbers agree, push to database and </w:t>
+              <w:t xml:space="preserve">Checks number of seats </w:t>
+            </w:r>
+            <w:proofErr w:type="gramStart"/>
+            <w:r>
+              <w:t>selected</w:t>
+            </w:r>
+            <w:proofErr w:type="gramEnd"/>
+            <w:r>
+              <w:t xml:space="preserve"> and seat type numbers agree, push to database and </w:t>
             </w:r>
             <w:r>
               <w:t>redirect to thank you page</w:t>
@@ -9998,8 +10260,13 @@
           </w:tcPr>
           <w:p>
             <w:r>
-              <w:t>Thank you page</w:t>
-            </w:r>
+              <w:t xml:space="preserve">Thank </w:t>
+            </w:r>
+            <w:proofErr w:type="gramStart"/>
+            <w:r>
+              <w:t>you page</w:t>
+            </w:r>
+            <w:proofErr w:type="gramEnd"/>
           </w:p>
         </w:tc>
         <w:tc>
@@ -10148,7 +10415,15 @@
           </w:tcPr>
           <w:p>
             <w:r>
-              <w:t>Top left (ish) of every admin page</w:t>
+              <w:t>Top left (</w:t>
+            </w:r>
+            <w:proofErr w:type="spellStart"/>
+            <w:r>
+              <w:t>ish</w:t>
+            </w:r>
+            <w:proofErr w:type="spellEnd"/>
+            <w:r>
+              <w:t>) of every admin page</w:t>
             </w:r>
           </w:p>
         </w:tc>
@@ -10715,7 +10990,15 @@
           </w:tcPr>
           <w:p>
             <w:r>
-              <w:t>Add date date select</w:t>
+              <w:t xml:space="preserve">Add date </w:t>
+            </w:r>
+            <w:proofErr w:type="spellStart"/>
+            <w:r>
+              <w:t>date</w:t>
+            </w:r>
+            <w:proofErr w:type="spellEnd"/>
+            <w:r>
+              <w:t xml:space="preserve"> select</w:t>
             </w:r>
           </w:p>
         </w:tc>
@@ -11061,14 +11344,23 @@
           <w:b/>
           <w:bCs/>
         </w:rPr>
+        <w:t>Development Testing:</w:t>
+      </w:r>
+    </w:p>
+    <w:p>
+      <w:r>
+        <w:rPr>
+          <w:b/>
+          <w:bCs/>
+        </w:rPr>
         <w:drawing>
-          <wp:anchor distT="0" distB="0" distL="114300" distR="114300" simplePos="0" relativeHeight="251700224" behindDoc="0" locked="0" layoutInCell="1" allowOverlap="1" wp14:anchorId="4FF1BFB8" wp14:editId="3A4A7AA0">
+          <wp:anchor distT="0" distB="0" distL="114300" distR="114300" simplePos="0" relativeHeight="251700224" behindDoc="0" locked="0" layoutInCell="1" allowOverlap="1" wp14:anchorId="4FF1BFB8" wp14:editId="4FED299E">
             <wp:simplePos x="0" y="0"/>
             <wp:positionH relativeFrom="margin">
               <wp:align>right</wp:align>
             </wp:positionH>
             <wp:positionV relativeFrom="paragraph">
-              <wp:posOffset>10160</wp:posOffset>
+              <wp:posOffset>5715</wp:posOffset>
             </wp:positionV>
             <wp:extent cx="5699760" cy="974090"/>
             <wp:effectExtent l="0" t="0" r="0" b="0"/>
@@ -11120,42 +11412,473 @@
         </w:drawing>
       </w:r>
       <w:r>
+        <w:t>Error #1:</w:t>
+      </w:r>
+    </w:p>
+    <w:p>
+      <w:r>
+        <w:t xml:space="preserve">The error pictured to the right occurred when trying to add functionality to custom prices for performances. My error was in using the incorrect data type in setting up my database. I used </w:t>
+      </w:r>
+      <w:proofErr w:type="gramStart"/>
+      <w:r>
+        <w:t>DECIMAL</w:t>
+      </w:r>
+      <w:r>
+        <w:t>(</w:t>
+      </w:r>
+      <w:proofErr w:type="gramEnd"/>
+      <w:r>
+        <w:t>2)</w:t>
+      </w:r>
+      <w:r>
+        <w:t xml:space="preserve"> without providing </w:t>
+      </w:r>
+      <w:proofErr w:type="gramStart"/>
+      <w:r>
+        <w:t>a number of</w:t>
+      </w:r>
+      <w:proofErr w:type="gramEnd"/>
+      <w:r>
+        <w:t xml:space="preserve"> decimal places. This meant that values were automatically rounded to the nearest whole number</w:t>
+      </w:r>
+      <w:r>
+        <w:t>.</w:t>
+      </w:r>
+      <w:r>
+        <w:t xml:space="preserve"> A similar issue occurred when trying to insert values for price with any more than 2 digits before the decimal point.</w:t>
+      </w:r>
+      <w:r>
+        <w:t xml:space="preserve"> Corrected by changing SQL table creation command to </w:t>
+      </w:r>
+      <w:proofErr w:type="gramStart"/>
+      <w:r>
+        <w:t>DECIMAL(</w:t>
+      </w:r>
+      <w:proofErr w:type="gramEnd"/>
+      <w:r>
+        <w:t>7</w:t>
+      </w:r>
+      <w:r>
+        <w:t>, 2)</w:t>
+      </w:r>
+    </w:p>
+    <w:p/>
+    <w:p>
+      <w:r>
+        <w:rPr>
+          <w:noProof/>
+        </w:rPr>
+        <w:drawing>
+          <wp:anchor distT="0" distB="0" distL="114300" distR="114300" simplePos="0" relativeHeight="251701248" behindDoc="1" locked="0" layoutInCell="1" allowOverlap="1" wp14:anchorId="2C7E2274" wp14:editId="3A864D85">
+            <wp:simplePos x="0" y="0"/>
+            <wp:positionH relativeFrom="margin">
+              <wp:align>right</wp:align>
+            </wp:positionH>
+            <wp:positionV relativeFrom="paragraph">
+              <wp:posOffset>3810</wp:posOffset>
+            </wp:positionV>
+            <wp:extent cx="3924300" cy="708660"/>
+            <wp:effectExtent l="0" t="0" r="0" b="0"/>
+            <wp:wrapTight wrapText="bothSides">
+              <wp:wrapPolygon edited="0">
+                <wp:start x="0" y="0"/>
+                <wp:lineTo x="0" y="20903"/>
+                <wp:lineTo x="21495" y="20903"/>
+                <wp:lineTo x="21495" y="0"/>
+                <wp:lineTo x="0" y="0"/>
+              </wp:wrapPolygon>
+            </wp:wrapTight>
+            <wp:docPr id="1345598849" name="Picture 2"/>
+            <wp:cNvGraphicFramePr>
+              <a:graphicFrameLocks xmlns:a="http://schemas.openxmlformats.org/drawingml/2006/main" noChangeAspect="1"/>
+            </wp:cNvGraphicFramePr>
+            <a:graphic xmlns:a="http://schemas.openxmlformats.org/drawingml/2006/main">
+              <a:graphicData uri="http://schemas.openxmlformats.org/drawingml/2006/picture">
+                <pic:pic xmlns:pic="http://schemas.openxmlformats.org/drawingml/2006/picture">
+                  <pic:nvPicPr>
+                    <pic:cNvPr id="0" name="Picture 2"/>
+                    <pic:cNvPicPr>
+                      <a:picLocks noChangeAspect="1" noChangeArrowheads="1"/>
+                    </pic:cNvPicPr>
+                  </pic:nvPicPr>
+                  <pic:blipFill>
+                    <a:blip r:embed="rId32">
+                      <a:extLst>
+                        <a:ext uri="{28A0092B-C50C-407E-A947-70E740481C1C}">
+                          <a14:useLocalDpi xmlns:a14="http://schemas.microsoft.com/office/drawing/2010/main" val="0"/>
+                        </a:ext>
+                      </a:extLst>
+                    </a:blip>
+                    <a:srcRect/>
+                    <a:stretch>
+                      <a:fillRect/>
+                    </a:stretch>
+                  </pic:blipFill>
+                  <pic:spPr bwMode="auto">
+                    <a:xfrm>
+                      <a:off x="0" y="0"/>
+                      <a:ext cx="3924300" cy="708660"/>
+                    </a:xfrm>
+                    <a:prstGeom prst="rect">
+                      <a:avLst/>
+                    </a:prstGeom>
+                    <a:noFill/>
+                    <a:ln>
+                      <a:noFill/>
+                    </a:ln>
+                  </pic:spPr>
+                </pic:pic>
+              </a:graphicData>
+            </a:graphic>
+            <wp14:sizeRelH relativeFrom="page">
+              <wp14:pctWidth>0</wp14:pctWidth>
+            </wp14:sizeRelH>
+            <wp14:sizeRelV relativeFrom="page">
+              <wp14:pctHeight>0</wp14:pctHeight>
+            </wp14:sizeRelV>
+          </wp:anchor>
+        </w:drawing>
+      </w:r>
+      <w:r>
+        <w:t>Error #2:</w:t>
+      </w:r>
+    </w:p>
+    <w:p>
+      <w:r>
+        <w:t xml:space="preserve">This was a simple error that came from me copy and pasting this code </w:t>
+      </w:r>
+      <w:proofErr w:type="gramStart"/>
+      <w:r>
+        <w:t>so as to</w:t>
+      </w:r>
+      <w:proofErr w:type="gramEnd"/>
+      <w:r>
+        <w:t xml:space="preserve"> save myself time. You can see in the screenshot that I forgot to change the str(</w:t>
+      </w:r>
+      <w:proofErr w:type="spellStart"/>
+      <w:r>
+        <w:t>adult_price</w:t>
+      </w:r>
+      <w:proofErr w:type="spellEnd"/>
+      <w:r>
+        <w:t xml:space="preserve">) in the third line to </w:t>
+      </w:r>
+      <w:proofErr w:type="spellStart"/>
+      <w:r>
+        <w:t>elderly_price</w:t>
+      </w:r>
+      <w:proofErr w:type="spellEnd"/>
+      <w:r>
+        <w:t xml:space="preserve">. This meant that </w:t>
+      </w:r>
+      <w:r>
+        <w:t>it was not correctly validating the number of decimal places in the number which led to errors. Fortunately, this was caught during my unit testing.</w:t>
+      </w:r>
+    </w:p>
+    <w:p/>
+    <w:p>
+      <w:r>
+        <w:rPr>
+          <w:noProof/>
+        </w:rPr>
+        <w:drawing>
+          <wp:anchor distT="0" distB="0" distL="114300" distR="114300" simplePos="0" relativeHeight="251702272" behindDoc="1" locked="0" layoutInCell="1" allowOverlap="1" wp14:anchorId="17A1C3E4" wp14:editId="0B068956">
+            <wp:simplePos x="0" y="0"/>
+            <wp:positionH relativeFrom="margin">
+              <wp:align>right</wp:align>
+            </wp:positionH>
+            <wp:positionV relativeFrom="paragraph">
+              <wp:posOffset>6350</wp:posOffset>
+            </wp:positionV>
+            <wp:extent cx="6511925" cy="1109982"/>
+            <wp:effectExtent l="0" t="0" r="3175" b="0"/>
+            <wp:wrapTight wrapText="bothSides">
+              <wp:wrapPolygon edited="0">
+                <wp:start x="0" y="0"/>
+                <wp:lineTo x="0" y="21130"/>
+                <wp:lineTo x="21547" y="21130"/>
+                <wp:lineTo x="21547" y="0"/>
+                <wp:lineTo x="0" y="0"/>
+              </wp:wrapPolygon>
+            </wp:wrapTight>
+            <wp:docPr id="893640264" name="Picture 3"/>
+            <wp:cNvGraphicFramePr>
+              <a:graphicFrameLocks xmlns:a="http://schemas.openxmlformats.org/drawingml/2006/main" noChangeAspect="1"/>
+            </wp:cNvGraphicFramePr>
+            <a:graphic xmlns:a="http://schemas.openxmlformats.org/drawingml/2006/main">
+              <a:graphicData uri="http://schemas.openxmlformats.org/drawingml/2006/picture">
+                <pic:pic xmlns:pic="http://schemas.openxmlformats.org/drawingml/2006/picture">
+                  <pic:nvPicPr>
+                    <pic:cNvPr id="0" name="Picture 3"/>
+                    <pic:cNvPicPr>
+                      <a:picLocks noChangeAspect="1" noChangeArrowheads="1"/>
+                    </pic:cNvPicPr>
+                  </pic:nvPicPr>
+                  <pic:blipFill>
+                    <a:blip r:embed="rId33">
+                      <a:extLst>
+                        <a:ext uri="{28A0092B-C50C-407E-A947-70E740481C1C}">
+                          <a14:useLocalDpi xmlns:a14="http://schemas.microsoft.com/office/drawing/2010/main" val="0"/>
+                        </a:ext>
+                      </a:extLst>
+                    </a:blip>
+                    <a:srcRect/>
+                    <a:stretch>
+                      <a:fillRect/>
+                    </a:stretch>
+                  </pic:blipFill>
+                  <pic:spPr bwMode="auto">
+                    <a:xfrm>
+                      <a:off x="0" y="0"/>
+                      <a:ext cx="6511925" cy="1109982"/>
+                    </a:xfrm>
+                    <a:prstGeom prst="rect">
+                      <a:avLst/>
+                    </a:prstGeom>
+                    <a:noFill/>
+                    <a:ln>
+                      <a:noFill/>
+                    </a:ln>
+                  </pic:spPr>
+                </pic:pic>
+              </a:graphicData>
+            </a:graphic>
+            <wp14:sizeRelH relativeFrom="page">
+              <wp14:pctWidth>0</wp14:pctWidth>
+            </wp14:sizeRelH>
+            <wp14:sizeRelV relativeFrom="page">
+              <wp14:pctHeight>0</wp14:pctHeight>
+            </wp14:sizeRelV>
+          </wp:anchor>
+        </w:drawing>
+      </w:r>
+      <w:r>
+        <w:t>Error #3:</w:t>
+      </w:r>
+    </w:p>
+    <w:p>
+      <w:r>
+        <w:t xml:space="preserve">This error was another simple one. You can see in the </w:t>
+      </w:r>
+      <w:proofErr w:type="gramStart"/>
+      <w:r>
+        <w:t>warnings</w:t>
+      </w:r>
+      <w:proofErr w:type="gramEnd"/>
+      <w:r>
+        <w:t xml:space="preserve"> summary as well as the code screenshot below that I forgot to </w:t>
+      </w:r>
+      <w:r>
+        <w:rPr>
+          <w:noProof/>
+        </w:rPr>
+        <w:lastRenderedPageBreak/>
+        <w:drawing>
+          <wp:anchor distT="0" distB="0" distL="114300" distR="114300" simplePos="0" relativeHeight="251703296" behindDoc="1" locked="0" layoutInCell="1" allowOverlap="1" wp14:anchorId="147C6152" wp14:editId="0AD78A81">
+            <wp:simplePos x="0" y="0"/>
+            <wp:positionH relativeFrom="column">
+              <wp:posOffset>2331720</wp:posOffset>
+            </wp:positionH>
+            <wp:positionV relativeFrom="paragraph">
+              <wp:posOffset>0</wp:posOffset>
+            </wp:positionV>
+            <wp:extent cx="6524625" cy="421005"/>
+            <wp:effectExtent l="0" t="0" r="9525" b="0"/>
+            <wp:wrapTight wrapText="bothSides">
+              <wp:wrapPolygon edited="0">
+                <wp:start x="0" y="0"/>
+                <wp:lineTo x="0" y="20525"/>
+                <wp:lineTo x="21568" y="20525"/>
+                <wp:lineTo x="21568" y="0"/>
+                <wp:lineTo x="0" y="0"/>
+              </wp:wrapPolygon>
+            </wp:wrapTight>
+            <wp:docPr id="1391347449" name="Picture 4"/>
+            <wp:cNvGraphicFramePr>
+              <a:graphicFrameLocks xmlns:a="http://schemas.openxmlformats.org/drawingml/2006/main" noChangeAspect="1"/>
+            </wp:cNvGraphicFramePr>
+            <a:graphic xmlns:a="http://schemas.openxmlformats.org/drawingml/2006/main">
+              <a:graphicData uri="http://schemas.openxmlformats.org/drawingml/2006/picture">
+                <pic:pic xmlns:pic="http://schemas.openxmlformats.org/drawingml/2006/picture">
+                  <pic:nvPicPr>
+                    <pic:cNvPr id="0" name="Picture 4"/>
+                    <pic:cNvPicPr>
+                      <a:picLocks noChangeAspect="1" noChangeArrowheads="1"/>
+                    </pic:cNvPicPr>
+                  </pic:nvPicPr>
+                  <pic:blipFill>
+                    <a:blip r:embed="rId34">
+                      <a:extLst>
+                        <a:ext uri="{28A0092B-C50C-407E-A947-70E740481C1C}">
+                          <a14:useLocalDpi xmlns:a14="http://schemas.microsoft.com/office/drawing/2010/main" val="0"/>
+                        </a:ext>
+                      </a:extLst>
+                    </a:blip>
+                    <a:srcRect/>
+                    <a:stretch>
+                      <a:fillRect/>
+                    </a:stretch>
+                  </pic:blipFill>
+                  <pic:spPr bwMode="auto">
+                    <a:xfrm>
+                      <a:off x="0" y="0"/>
+                      <a:ext cx="6524625" cy="421005"/>
+                    </a:xfrm>
+                    <a:prstGeom prst="rect">
+                      <a:avLst/>
+                    </a:prstGeom>
+                    <a:noFill/>
+                    <a:ln>
+                      <a:noFill/>
+                    </a:ln>
+                  </pic:spPr>
+                </pic:pic>
+              </a:graphicData>
+            </a:graphic>
+            <wp14:sizeRelH relativeFrom="page">
+              <wp14:pctWidth>0</wp14:pctWidth>
+            </wp14:sizeRelH>
+            <wp14:sizeRelV relativeFrom="page">
+              <wp14:pctHeight>0</wp14:pctHeight>
+            </wp14:sizeRelV>
+          </wp:anchor>
+        </w:drawing>
+      </w:r>
+      <w:r>
+        <w:t xml:space="preserve">add the comma in my SQL statement where I insert the variables. It read (“SELECT </w:t>
+      </w:r>
+      <w:proofErr w:type="spellStart"/>
+      <w:r>
+        <w:t>childPrice</w:t>
+      </w:r>
+      <w:proofErr w:type="spellEnd"/>
+      <w:r>
+        <w:t xml:space="preserve">, </w:t>
+      </w:r>
+      <w:proofErr w:type="spellStart"/>
+      <w:r>
+        <w:t>adultPrice</w:t>
+      </w:r>
+      <w:proofErr w:type="spellEnd"/>
+      <w:r>
+        <w:t xml:space="preserve">, </w:t>
+      </w:r>
+      <w:proofErr w:type="spellStart"/>
+      <w:r>
+        <w:t>elderlyPrice</w:t>
+      </w:r>
+      <w:proofErr w:type="spellEnd"/>
+      <w:r>
+        <w:t xml:space="preserve"> FROM </w:t>
+      </w:r>
+      <w:proofErr w:type="spellStart"/>
+      <w:proofErr w:type="gramStart"/>
+      <w:r>
+        <w:t>dbo.Performances</w:t>
+      </w:r>
+      <w:proofErr w:type="spellEnd"/>
+      <w:proofErr w:type="gramEnd"/>
+      <w:r>
+        <w:t xml:space="preserve"> WHERE </w:t>
+      </w:r>
+      <w:proofErr w:type="spellStart"/>
+      <w:r>
+        <w:t>performanceID</w:t>
+      </w:r>
+      <w:proofErr w:type="spellEnd"/>
+      <w:r>
+        <w:t xml:space="preserve"> </w:t>
+      </w:r>
+      <w:proofErr w:type="gramStart"/>
+      <w:r>
+        <w:t>= ?</w:t>
+      </w:r>
+      <w:proofErr w:type="gramEnd"/>
+      <w:r>
+        <w:t>” (</w:t>
+      </w:r>
+      <w:proofErr w:type="spellStart"/>
+      <w:r>
+        <w:t>performanceID</w:t>
+      </w:r>
+      <w:proofErr w:type="spellEnd"/>
+      <w:r>
+        <w:t xml:space="preserve">)) where it should have read </w:t>
+      </w:r>
+      <w:r>
+        <w:t xml:space="preserve">(“SELECT </w:t>
+      </w:r>
+      <w:proofErr w:type="spellStart"/>
+      <w:r>
+        <w:t>childPrice</w:t>
+      </w:r>
+      <w:proofErr w:type="spellEnd"/>
+      <w:r>
+        <w:t xml:space="preserve">, </w:t>
+      </w:r>
+      <w:proofErr w:type="spellStart"/>
+      <w:r>
+        <w:t>adultPrice</w:t>
+      </w:r>
+      <w:proofErr w:type="spellEnd"/>
+      <w:r>
+        <w:t xml:space="preserve">, </w:t>
+      </w:r>
+      <w:proofErr w:type="spellStart"/>
+      <w:r>
+        <w:t>elderlyPrice</w:t>
+      </w:r>
+      <w:proofErr w:type="spellEnd"/>
+      <w:r>
+        <w:t xml:space="preserve"> FROM </w:t>
+      </w:r>
+      <w:proofErr w:type="spellStart"/>
+      <w:proofErr w:type="gramStart"/>
+      <w:r>
+        <w:t>dbo.Performances</w:t>
+      </w:r>
+      <w:proofErr w:type="spellEnd"/>
+      <w:proofErr w:type="gramEnd"/>
+      <w:r>
+        <w:t xml:space="preserve"> WHERE </w:t>
+      </w:r>
+      <w:proofErr w:type="spellStart"/>
+      <w:r>
+        <w:t>performanceID</w:t>
+      </w:r>
+      <w:proofErr w:type="spellEnd"/>
+      <w:r>
+        <w:t xml:space="preserve"> </w:t>
+      </w:r>
+      <w:proofErr w:type="gramStart"/>
+      <w:r>
+        <w:t>= ?</w:t>
+      </w:r>
+      <w:proofErr w:type="gramEnd"/>
+      <w:r>
+        <w:t>”</w:t>
+      </w:r>
+      <w:r>
         <w:rPr>
           <w:b/>
           <w:bCs/>
-        </w:rPr>
-        <w:t>Development Testing:</w:t>
-      </w:r>
-    </w:p>
-    <w:p>
-      <w:r>
-        <w:t>Error #1:</w:t>
-      </w:r>
-    </w:p>
-    <w:p>
-      <w:r>
-        <w:t>The error pictured to the right occurred when trying to add functionality to custom prices for performances. My error was in using the incorrect data type in setting up my database. I used DECIMAL</w:t>
-      </w:r>
-      <w:r>
-        <w:t>(2)</w:t>
-      </w:r>
-      <w:r>
-        <w:t xml:space="preserve"> without providing a number of decimal places. This meant that values were automatically rounded to the nearest whole number</w:t>
+          <w:highlight w:val="green"/>
+        </w:rPr>
+        <w:t>,</w:t>
+      </w:r>
+      <w:r>
+        <w:t xml:space="preserve"> (</w:t>
+      </w:r>
+      <w:proofErr w:type="spellStart"/>
+      <w:r>
+        <w:t>performanceID</w:t>
+      </w:r>
+      <w:proofErr w:type="spellEnd"/>
+      <w:r>
+        <w:t>))</w:t>
       </w:r>
       <w:r>
         <w:t>.</w:t>
-      </w:r>
-      <w:r>
-        <w:t xml:space="preserve"> A similar issue occurred when trying to insert values for price with any more than 2 digits before the decimal point.</w:t>
-      </w:r>
-      <w:r>
-        <w:t xml:space="preserve"> Corrected by changing SQL table creation command to DECIMAL(</w:t>
-      </w:r>
-      <w:r>
-        <w:t>7</w:t>
-      </w:r>
-      <w:r>
-        <w:t>, 2)</w:t>
       </w:r>
     </w:p>
     <w:p/>

</xml_diff>

<commit_message>
Implemented mark seat unavailable
</commit_message>
<xml_diff>
--- a/documentation/George Cooke - Theatre Booking Documentation.docx
+++ b/documentation/George Cooke - Theatre Booking Documentation.docx
@@ -766,18 +766,10 @@
     </w:p>
     <w:p>
       <w:r>
-        <w:t xml:space="preserve">There are a multitude of different booking apps used around the world for all different purposes. Some are to book tickets to films, other for music festivals, some for sports, and some </w:t>
-      </w:r>
-      <w:proofErr w:type="gramStart"/>
-      <w:r>
-        <w:t xml:space="preserve">for </w:t>
-      </w:r>
-      <w:r>
-        <w:t>aircraft</w:t>
-      </w:r>
-      <w:proofErr w:type="gramEnd"/>
-      <w:r>
-        <w:t xml:space="preserve"> seats</w:t>
+        <w:t xml:space="preserve">There are a multitude of different booking apps used around the world for all different purposes. Some are to book tickets to films, other for music festivals, some for sports, and some for </w:t>
+      </w:r>
+      <w:r>
+        <w:t>aircraft seats</w:t>
       </w:r>
       <w:r>
         <w:t xml:space="preserve">. </w:t>
@@ -905,15 +897,7 @@
         <w:t xml:space="preserve"> I will likely replace this page with a custom one</w:t>
       </w:r>
       <w:r>
-        <w:t xml:space="preserve"> of my own design with just </w:t>
-      </w:r>
-      <w:proofErr w:type="gramStart"/>
-      <w:r>
-        <w:t>a number of</w:t>
-      </w:r>
-      <w:proofErr w:type="gramEnd"/>
-      <w:r>
-        <w:t xml:space="preserve"> simple buttons each with the date that they represent.</w:t>
+        <w:t xml:space="preserve"> of my own design with just a number of simple buttons each with the date that they represent.</w:t>
       </w:r>
     </w:p>
     <w:p>
@@ -1514,15 +1498,7 @@
         <w:t xml:space="preserve">As such, it will be important </w:t>
       </w:r>
       <w:r>
-        <w:t xml:space="preserve">for seats to be blocked off for these purposes by admin staff so that the </w:t>
-      </w:r>
-      <w:proofErr w:type="gramStart"/>
-      <w:r>
-        <w:t>general public</w:t>
-      </w:r>
-      <w:proofErr w:type="gramEnd"/>
-      <w:r>
-        <w:t xml:space="preserve"> cannot buy specific seats.</w:t>
+        <w:t>for seats to be blocked off for these purposes by admin staff so that the general public cannot buy specific seats.</w:t>
       </w:r>
     </w:p>
     <w:p/>
@@ -1692,64 +1668,43 @@
         <w:t xml:space="preserve"> copy and comparing the name to the people attending. While the names will be sorted alphabetically by surname, it could be helpful to have search functionality.</w:t>
       </w:r>
       <w:r>
+        <w:t xml:space="preserve"> That being said, it is not necessary as they will be able to go through </w:t>
+      </w:r>
+      <w:r>
+        <w:t xml:space="preserve">the names by alphabetical order. Furthermore, many events do not check tickets against their platform and instead opt to take tickets as what they appear to be. As such, </w:t>
+      </w:r>
+      <w:r>
+        <w:t>this will be added to the stretch targets.</w:t>
+      </w:r>
+    </w:p>
+    <w:p>
+      <w:r>
+        <w:tab/>
+        <w:t>It could also be helpful to admin staff to be able to book tickets themselves for other people. This would be similar to staff at cinemas being able to buy you a ticket</w:t>
+      </w:r>
+      <w:r>
+        <w:t>. This would not be possible with the current system. The main demographic that would find this helpful would be the elderly</w:t>
+      </w:r>
+      <w:r>
+        <w:t xml:space="preserve"> and those without technology access.</w:t>
+      </w:r>
+      <w:r>
+        <w:t xml:space="preserve"> The use of </w:t>
+      </w:r>
+      <w:r>
+        <w:t>face-to-face</w:t>
+      </w:r>
+      <w:r>
+        <w:t xml:space="preserve"> systems like this is falling in the current climate so the use of something like this may not be what it would have been ten years ago.</w:t>
+      </w:r>
+      <w:r>
         <w:t xml:space="preserve"> </w:t>
       </w:r>
-      <w:proofErr w:type="gramStart"/>
-      <w:r>
-        <w:t>That being said, it</w:t>
-      </w:r>
-      <w:proofErr w:type="gramEnd"/>
-      <w:r>
-        <w:t xml:space="preserve"> is not necessary as they will be able to go through </w:t>
-      </w:r>
-      <w:r>
-        <w:t xml:space="preserve">the names by alphabetical order. Furthermore, many events do not check tickets against their platform and instead opt to take tickets as what they appear to be. As such, </w:t>
-      </w:r>
-      <w:r>
-        <w:t>this will be added to the stretch targets.</w:t>
-      </w:r>
-    </w:p>
-    <w:p>
-      <w:r>
-        <w:tab/>
-        <w:t xml:space="preserve">It could also be helpful to admin staff to be able to book tickets themselves for other people. This would be </w:t>
-      </w:r>
-      <w:proofErr w:type="gramStart"/>
-      <w:r>
-        <w:t>similar to</w:t>
-      </w:r>
-      <w:proofErr w:type="gramEnd"/>
-      <w:r>
-        <w:t xml:space="preserve"> staff at cinemas being able to buy you a ticket</w:t>
-      </w:r>
-      <w:r>
-        <w:t>. This would not be possible with the current system. The main demographic that would find this helpful would be the elderly</w:t>
-      </w:r>
-      <w:r>
-        <w:t xml:space="preserve"> and those without technology access.</w:t>
-      </w:r>
-      <w:r>
-        <w:t xml:space="preserve"> The use of </w:t>
-      </w:r>
-      <w:r>
-        <w:t>face-to-face</w:t>
-      </w:r>
-      <w:r>
-        <w:t xml:space="preserve"> systems like this is falling in the current climate so the use of something like this may not be what it would have been ten years ago.</w:t>
-      </w:r>
-      <w:r>
-        <w:t xml:space="preserve"> </w:t>
-      </w:r>
       <w:r>
         <w:t xml:space="preserve">Furthermore, the elderly can be seen (from a business point of view) as a less valuable customer on account of their reduced ticket price. As such, it would not be economical to go to such great lengths to accommodate them. </w:t>
       </w:r>
-      <w:proofErr w:type="gramStart"/>
-      <w:r>
-        <w:t>That being said, it</w:t>
-      </w:r>
-      <w:proofErr w:type="gramEnd"/>
-      <w:r>
-        <w:t xml:space="preserve"> would help to reduce the digital divide and build a more accommodating society.</w:t>
+      <w:r>
+        <w:t>That being said, it would help to reduce the digital divide and build a more accommodating society.</w:t>
       </w:r>
       <w:r>
         <w:t xml:space="preserve"> Ultimately, it would be beneficial to have the ability for admin staff to be able to book seats </w:t>
@@ -1777,23 +1732,7 @@
     <w:p>
       <w:r>
         <w:lastRenderedPageBreak/>
-        <w:t xml:space="preserve">Visitors make up </w:t>
-      </w:r>
-      <w:proofErr w:type="gramStart"/>
-      <w:r>
-        <w:t>the majority of</w:t>
-      </w:r>
-      <w:proofErr w:type="gramEnd"/>
-      <w:r>
-        <w:t xml:space="preserve"> the user base for this </w:t>
-      </w:r>
-      <w:proofErr w:type="gramStart"/>
-      <w:r>
-        <w:t>program</w:t>
-      </w:r>
-      <w:proofErr w:type="gramEnd"/>
-      <w:r>
-        <w:t xml:space="preserve"> </w:t>
+        <w:t xml:space="preserve">Visitors make up the majority of the user base for this program </w:t>
       </w:r>
       <w:r>
         <w:t>and their side of the systems will need the most attention as a result. Visitors should be assumed to be new to the platform and will therefore need more instructions and directions for what to do compared to admin staff that would have experience and training in the software.</w:t>
@@ -1876,26 +1815,10 @@
     </w:p>
     <w:p>
       <w:r>
-        <w:t xml:space="preserve">While this is the most critical part of the system, it is also the most intuitive </w:t>
-      </w:r>
-      <w:proofErr w:type="gramStart"/>
-      <w:r>
-        <w:t xml:space="preserve">owing to </w:t>
-      </w:r>
-      <w:r>
-        <w:t>the fact that</w:t>
-      </w:r>
-      <w:proofErr w:type="gramEnd"/>
-      <w:r>
-        <w:t xml:space="preserve"> everyone (</w:t>
-      </w:r>
-      <w:proofErr w:type="gramStart"/>
-      <w:r>
-        <w:t>myself</w:t>
-      </w:r>
-      <w:proofErr w:type="gramEnd"/>
-      <w:r>
-        <w:t xml:space="preserve"> included) has had extensive experience with them. This will mean that I can draw inspiration from other similar systems (see above) and draw on users’ </w:t>
+        <w:t xml:space="preserve">While this is the most critical part of the system, it is also the most intuitive owing to </w:t>
+      </w:r>
+      <w:r>
+        <w:t xml:space="preserve">the fact that everyone (myself included) has had extensive experience with them. This will mean that I can draw inspiration from other similar systems (see above) and draw on users’ </w:t>
       </w:r>
       <w:r>
         <w:t>knowledge on how to use them to reduce the need for instruction.</w:t>
@@ -1936,23 +1859,7 @@
         <w:t xml:space="preserve">While the disabled community makes up a small percentage of the British population </w:t>
       </w:r>
       <w:r>
-        <w:t xml:space="preserve">(approximately 4.9% of the British population have blue badges), Collyer’s is a large </w:t>
-      </w:r>
-      <w:proofErr w:type="gramStart"/>
-      <w:r>
-        <w:t>institution</w:t>
-      </w:r>
-      <w:proofErr w:type="gramEnd"/>
-      <w:r>
-        <w:t xml:space="preserve"> and it would be reasonable to assume that it has </w:t>
-      </w:r>
-      <w:proofErr w:type="gramStart"/>
-      <w:r>
-        <w:t>a number of</w:t>
-      </w:r>
-      <w:proofErr w:type="gramEnd"/>
-      <w:r>
-        <w:t xml:space="preserve"> students and carers with disabilities that would require special allowances. </w:t>
+        <w:t xml:space="preserve">(approximately 4.9% of the British population have blue badges), Collyer’s is a large institution and it would be reasonable to assume that it has a number of students and carers with disabilities that would require special allowances. </w:t>
       </w:r>
       <w:r>
         <w:t>There is little that the system itself would need to do to accommodate for these people as the bulk of that responsibility falls on the event organisers.</w:t>
@@ -2502,34 +2409,10 @@
         <w:t xml:space="preserve">I will be making use of Flask for my </w:t>
       </w:r>
       <w:r>
-        <w:t xml:space="preserve">application. This is both because it is more realistic to what a client would want with it enabling users to book online from anywhere but also because I think it is the best option for me. I am inexperienced with </w:t>
-      </w:r>
-      <w:proofErr w:type="spellStart"/>
-      <w:r>
-        <w:t>PyQt</w:t>
-      </w:r>
-      <w:proofErr w:type="spellEnd"/>
-      <w:r>
-        <w:t xml:space="preserve"> and would rather keep my distance from it</w:t>
-      </w:r>
-      <w:r>
-        <w:t xml:space="preserve">. I would be open to using tkinter or custom </w:t>
-      </w:r>
-      <w:proofErr w:type="gramStart"/>
-      <w:r>
-        <w:t>tkinter</w:t>
-      </w:r>
-      <w:proofErr w:type="gramEnd"/>
-      <w:r>
-        <w:t xml:space="preserve"> but I believe that there would be great performance issues on the booking page as it </w:t>
-      </w:r>
-      <w:proofErr w:type="gramStart"/>
-      <w:r>
-        <w:t>has to</w:t>
-      </w:r>
-      <w:proofErr w:type="gramEnd"/>
-      <w:r>
-        <w:t xml:space="preserve"> render 200 different seats. As a result, I believe that a web page is the most appropriate choice.</w:t>
+        <w:t>application. This is both because it is more realistic to what a client would want with it enabling users to book online from anywhere but also because I think it is the best option for me. I am inexperienced with PyQt and would rather keep my distance from it</w:t>
+      </w:r>
+      <w:r>
+        <w:t>. I would be open to using tkinter or custom tkinter but I believe that there would be great performance issues on the booking page as it has to render 200 different seats. As a result, I believe that a web page is the most appropriate choice.</w:t>
       </w:r>
     </w:p>
     <w:p>
@@ -2827,15 +2710,7 @@
         <w:t xml:space="preserve"> that I am most used to interacting with and I will thus be better equipped to visualise what a user would expect </w:t>
       </w:r>
       <w:r>
-        <w:t xml:space="preserve">through this medium. I will then go on to use this as a tool to help me make flow charts and diagrams explaining </w:t>
-      </w:r>
-      <w:proofErr w:type="gramStart"/>
-      <w:r>
-        <w:t>all of</w:t>
-      </w:r>
-      <w:proofErr w:type="gramEnd"/>
-      <w:r>
-        <w:t xml:space="preserve"> the different subroutines I will need to make.</w:t>
+        <w:t>through this medium. I will then go on to use this as a tool to help me make flow charts and diagrams explaining all of the different subroutines I will need to make.</w:t>
       </w:r>
     </w:p>
     <w:p>
@@ -4861,11 +4736,9 @@
             <w:tcW w:w="1242" w:type="dxa"/>
           </w:tcPr>
           <w:p>
-            <w:proofErr w:type="spellStart"/>
             <w:r>
               <w:t>UserID</w:t>
             </w:r>
-            <w:proofErr w:type="spellEnd"/>
           </w:p>
         </w:tc>
         <w:tc>
@@ -4925,11 +4798,9 @@
             <w:tcW w:w="1242" w:type="dxa"/>
           </w:tcPr>
           <w:p>
-            <w:proofErr w:type="spellStart"/>
             <w:r>
               <w:t>firstName</w:t>
             </w:r>
-            <w:proofErr w:type="spellEnd"/>
           </w:p>
         </w:tc>
         <w:tc>
@@ -4937,13 +4808,8 @@
             <w:tcW w:w="1661" w:type="dxa"/>
           </w:tcPr>
           <w:p>
-            <w:proofErr w:type="gramStart"/>
-            <w:r>
-              <w:t>VARCHAR(</w:t>
-            </w:r>
-            <w:proofErr w:type="gramEnd"/>
-            <w:r>
-              <w:t>30)</w:t>
+            <w:r>
+              <w:t>VARCHAR(30)</w:t>
             </w:r>
           </w:p>
         </w:tc>
@@ -5000,11 +4866,9 @@
             <w:tcW w:w="1242" w:type="dxa"/>
           </w:tcPr>
           <w:p>
-            <w:proofErr w:type="spellStart"/>
             <w:r>
               <w:t>lastname</w:t>
             </w:r>
-            <w:proofErr w:type="spellEnd"/>
           </w:p>
         </w:tc>
         <w:tc>
@@ -5012,13 +4876,8 @@
             <w:tcW w:w="1661" w:type="dxa"/>
           </w:tcPr>
           <w:p>
-            <w:proofErr w:type="gramStart"/>
-            <w:r>
-              <w:t>VARCHAR(</w:t>
-            </w:r>
-            <w:proofErr w:type="gramEnd"/>
-            <w:r>
-              <w:t>30)</w:t>
+            <w:r>
+              <w:t>VARCHAR(30)</w:t>
             </w:r>
           </w:p>
         </w:tc>
@@ -5085,13 +4944,8 @@
             <w:tcW w:w="1661" w:type="dxa"/>
           </w:tcPr>
           <w:p>
-            <w:proofErr w:type="gramStart"/>
-            <w:r>
-              <w:t>VARCHAR(</w:t>
-            </w:r>
-            <w:proofErr w:type="gramEnd"/>
-            <w:r>
-              <w:t>100)</w:t>
+            <w:r>
+              <w:t>VARCHAR(100)</w:t>
             </w:r>
           </w:p>
         </w:tc>
@@ -5168,13 +5022,8 @@
             <w:tcW w:w="1661" w:type="dxa"/>
           </w:tcPr>
           <w:p>
-            <w:proofErr w:type="gramStart"/>
-            <w:r>
-              <w:t>VARCHAR(</w:t>
-            </w:r>
-            <w:proofErr w:type="gramEnd"/>
-            <w:r>
-              <w:t>50)</w:t>
+            <w:r>
+              <w:t>VARCHAR(50)</w:t>
             </w:r>
           </w:p>
         </w:tc>
@@ -5213,11 +5062,9 @@
             </w:r>
           </w:p>
           <w:p>
-            <w:proofErr w:type="spellStart"/>
             <w:r>
               <w:t>avjbiluahgl</w:t>
             </w:r>
-            <w:proofErr w:type="spellEnd"/>
           </w:p>
         </w:tc>
       </w:tr>
@@ -5237,11 +5084,9 @@
             <w:tcW w:w="1661" w:type="dxa"/>
           </w:tcPr>
           <w:p>
-            <w:proofErr w:type="gramStart"/>
             <w:r>
               <w:t>VARCHAR(</w:t>
             </w:r>
-            <w:proofErr w:type="gramEnd"/>
             <w:r>
               <w:t>16)</w:t>
             </w:r>
@@ -5300,11 +5145,9 @@
             <w:tcW w:w="1242" w:type="dxa"/>
           </w:tcPr>
           <w:p>
-            <w:proofErr w:type="spellStart"/>
             <w:r>
               <w:t>userType</w:t>
             </w:r>
-            <w:proofErr w:type="spellEnd"/>
           </w:p>
         </w:tc>
         <w:tc>
@@ -5312,14 +5155,12 @@
             <w:tcW w:w="1661" w:type="dxa"/>
           </w:tcPr>
           <w:p>
-            <w:proofErr w:type="gramStart"/>
             <w:r>
               <w:t>VARCHAR</w:t>
             </w:r>
             <w:r>
               <w:t>(</w:t>
             </w:r>
-            <w:proofErr w:type="gramEnd"/>
           </w:p>
         </w:tc>
         <w:tc>
@@ -5494,11 +5335,9 @@
             <w:tcW w:w="1861" w:type="dxa"/>
           </w:tcPr>
           <w:p>
-            <w:proofErr w:type="spellStart"/>
             <w:r>
               <w:t>BookingID</w:t>
             </w:r>
-            <w:proofErr w:type="spellEnd"/>
           </w:p>
         </w:tc>
         <w:tc>
@@ -5561,12 +5400,10 @@
             <w:tcW w:w="1861" w:type="dxa"/>
           </w:tcPr>
           <w:p>
-            <w:proofErr w:type="spellStart"/>
             <w:r>
               <w:lastRenderedPageBreak/>
               <w:t>ShowingID</w:t>
             </w:r>
-            <w:proofErr w:type="spellEnd"/>
           </w:p>
         </w:tc>
         <w:tc>
@@ -5626,11 +5463,9 @@
             <w:tcW w:w="1861" w:type="dxa"/>
           </w:tcPr>
           <w:p>
-            <w:proofErr w:type="spellStart"/>
             <w:r>
               <w:t>UserID</w:t>
             </w:r>
-            <w:proofErr w:type="spellEnd"/>
           </w:p>
         </w:tc>
         <w:tc>
@@ -5862,11 +5697,9 @@
             <w:pPr>
               <w:spacing w:after="160" w:line="278" w:lineRule="auto"/>
             </w:pPr>
-            <w:proofErr w:type="spellStart"/>
             <w:r>
               <w:t>BookingSeatID</w:t>
             </w:r>
-            <w:proofErr w:type="spellEnd"/>
           </w:p>
         </w:tc>
         <w:tc>
@@ -5981,11 +5814,9 @@
             </w:tcBorders>
           </w:tcPr>
           <w:p>
-            <w:proofErr w:type="spellStart"/>
             <w:r>
               <w:t>BookingID</w:t>
             </w:r>
-            <w:proofErr w:type="spellEnd"/>
           </w:p>
         </w:tc>
         <w:tc>
@@ -6084,11 +5915,9 @@
             </w:tcBorders>
           </w:tcPr>
           <w:p>
-            <w:proofErr w:type="spellStart"/>
             <w:r>
               <w:t>SeatID</w:t>
             </w:r>
-            <w:proofErr w:type="spellEnd"/>
           </w:p>
         </w:tc>
         <w:tc>
@@ -6102,11 +5931,9 @@
             </w:tcBorders>
           </w:tcPr>
           <w:p>
-            <w:proofErr w:type="gramStart"/>
             <w:r>
               <w:t>VARCHAR(</w:t>
             </w:r>
-            <w:proofErr w:type="gramEnd"/>
             <w:r>
               <w:t>3</w:t>
             </w:r>
@@ -6198,14 +6025,12 @@
             </w:tcBorders>
           </w:tcPr>
           <w:p>
-            <w:proofErr w:type="spellStart"/>
             <w:r>
               <w:t>bookingT</w:t>
             </w:r>
             <w:r>
               <w:t>ype</w:t>
             </w:r>
-            <w:proofErr w:type="spellEnd"/>
           </w:p>
         </w:tc>
         <w:tc>
@@ -6219,11 +6044,9 @@
             </w:tcBorders>
           </w:tcPr>
           <w:p>
-            <w:proofErr w:type="gramStart"/>
             <w:r>
               <w:t>VARCHAR(</w:t>
             </w:r>
-            <w:proofErr w:type="gramEnd"/>
             <w:r>
               <w:t>7</w:t>
             </w:r>
@@ -6424,11 +6247,9 @@
             <w:tcW w:w="1840" w:type="dxa"/>
           </w:tcPr>
           <w:p>
-            <w:proofErr w:type="spellStart"/>
             <w:r>
               <w:t>PerformanceID</w:t>
             </w:r>
-            <w:proofErr w:type="spellEnd"/>
           </w:p>
         </w:tc>
         <w:tc>
@@ -6498,13 +6319,8 @@
             <w:tcW w:w="1733" w:type="dxa"/>
           </w:tcPr>
           <w:p>
-            <w:proofErr w:type="gramStart"/>
-            <w:r>
-              <w:t>VARCHAR(</w:t>
-            </w:r>
-            <w:proofErr w:type="gramEnd"/>
-            <w:r>
-              <w:t>100)</w:t>
+            <w:r>
+              <w:t>VARCHAR(100)</w:t>
             </w:r>
           </w:p>
         </w:tc>
@@ -6568,7 +6384,6 @@
             <w:tcW w:w="1840" w:type="dxa"/>
           </w:tcPr>
           <w:p>
-            <w:proofErr w:type="spellStart"/>
             <w:r>
               <w:lastRenderedPageBreak/>
               <w:t>performanceD</w:t>
@@ -6576,7 +6391,6 @@
             <w:r>
               <w:t>escription</w:t>
             </w:r>
-            <w:proofErr w:type="spellEnd"/>
           </w:p>
         </w:tc>
         <w:tc>
@@ -6626,11 +6440,9 @@
             <w:tcW w:w="1840" w:type="dxa"/>
           </w:tcPr>
           <w:p>
-            <w:proofErr w:type="spellStart"/>
             <w:r>
               <w:t>childPrice</w:t>
             </w:r>
-            <w:proofErr w:type="spellEnd"/>
           </w:p>
         </w:tc>
         <w:tc>
@@ -6638,13 +6450,8 @@
             <w:tcW w:w="1733" w:type="dxa"/>
           </w:tcPr>
           <w:p>
-            <w:proofErr w:type="gramStart"/>
-            <w:r>
-              <w:t>DECIMAL(</w:t>
-            </w:r>
-            <w:proofErr w:type="gramEnd"/>
-            <w:r>
-              <w:t>2)</w:t>
+            <w:r>
+              <w:t>DECIMAL(2)</w:t>
             </w:r>
           </w:p>
         </w:tc>
@@ -6695,11 +6502,9 @@
             <w:tcW w:w="1840" w:type="dxa"/>
           </w:tcPr>
           <w:p>
-            <w:proofErr w:type="spellStart"/>
             <w:r>
               <w:t>adultPrice</w:t>
             </w:r>
-            <w:proofErr w:type="spellEnd"/>
           </w:p>
         </w:tc>
         <w:tc>
@@ -6707,13 +6512,8 @@
             <w:tcW w:w="1733" w:type="dxa"/>
           </w:tcPr>
           <w:p>
-            <w:proofErr w:type="gramStart"/>
-            <w:r>
-              <w:t>DECIMAL(</w:t>
-            </w:r>
-            <w:proofErr w:type="gramEnd"/>
-            <w:r>
-              <w:t>2)</w:t>
+            <w:r>
+              <w:t>DECIMAL(2)</w:t>
             </w:r>
           </w:p>
         </w:tc>
@@ -6764,11 +6564,9 @@
             <w:tcW w:w="1840" w:type="dxa"/>
           </w:tcPr>
           <w:p>
-            <w:proofErr w:type="spellStart"/>
             <w:r>
               <w:t>elderlyPrice</w:t>
             </w:r>
-            <w:proofErr w:type="spellEnd"/>
           </w:p>
         </w:tc>
         <w:tc>
@@ -6776,13 +6574,8 @@
             <w:tcW w:w="1733" w:type="dxa"/>
           </w:tcPr>
           <w:p>
-            <w:proofErr w:type="gramStart"/>
-            <w:r>
-              <w:t>DECIMAL(</w:t>
-            </w:r>
-            <w:proofErr w:type="gramEnd"/>
-            <w:r>
-              <w:t>2)</w:t>
+            <w:r>
+              <w:t>DECIMAL(2)</w:t>
             </w:r>
           </w:p>
         </w:tc>
@@ -6971,14 +6764,12 @@
             <w:tcW w:w="3322" w:type="dxa"/>
           </w:tcPr>
           <w:p>
-            <w:proofErr w:type="spellStart"/>
             <w:r>
               <w:t>PerformanceUnavailableSeats</w:t>
             </w:r>
             <w:r>
               <w:t>ID</w:t>
             </w:r>
-            <w:proofErr w:type="spellEnd"/>
           </w:p>
         </w:tc>
         <w:tc>
@@ -7038,11 +6829,9 @@
             <w:tcW w:w="3322" w:type="dxa"/>
           </w:tcPr>
           <w:p>
-            <w:proofErr w:type="spellStart"/>
             <w:r>
               <w:t>PerformanceID</w:t>
             </w:r>
-            <w:proofErr w:type="spellEnd"/>
           </w:p>
         </w:tc>
         <w:tc>
@@ -7102,11 +6891,9 @@
             <w:tcW w:w="3322" w:type="dxa"/>
           </w:tcPr>
           <w:p>
-            <w:proofErr w:type="spellStart"/>
             <w:r>
               <w:t>SeatID</w:t>
             </w:r>
-            <w:proofErr w:type="spellEnd"/>
           </w:p>
         </w:tc>
         <w:tc>
@@ -7114,11 +6901,9 @@
             <w:tcW w:w="1101" w:type="dxa"/>
           </w:tcPr>
           <w:p>
-            <w:proofErr w:type="gramStart"/>
             <w:r>
               <w:t>VARCHAR(</w:t>
             </w:r>
-            <w:proofErr w:type="gramEnd"/>
             <w:r>
               <w:t>3</w:t>
             </w:r>
@@ -7135,14 +6920,12 @@
             <w:r>
               <w:t xml:space="preserve">Unique identifier for every </w:t>
             </w:r>
-            <w:proofErr w:type="gramStart"/>
             <w:r>
               <w:t xml:space="preserve">unavailable </w:t>
             </w:r>
             <w:r>
               <w:t xml:space="preserve"> seat</w:t>
             </w:r>
-            <w:proofErr w:type="gramEnd"/>
           </w:p>
         </w:tc>
         <w:tc>
@@ -7314,11 +7097,9 @@
             <w:tcW w:w="3322" w:type="dxa"/>
           </w:tcPr>
           <w:p>
-            <w:proofErr w:type="spellStart"/>
             <w:r>
               <w:t>SeatID</w:t>
             </w:r>
-            <w:proofErr w:type="spellEnd"/>
           </w:p>
         </w:tc>
         <w:tc>
@@ -7326,13 +7107,8 @@
             <w:tcW w:w="1101" w:type="dxa"/>
           </w:tcPr>
           <w:p>
-            <w:proofErr w:type="gramStart"/>
-            <w:r>
-              <w:t>VARCHAR(</w:t>
-            </w:r>
-            <w:proofErr w:type="gramEnd"/>
-            <w:r>
-              <w:t>3)</w:t>
+            <w:r>
+              <w:t>VARCHAR(3)</w:t>
             </w:r>
           </w:p>
         </w:tc>
@@ -7521,11 +7297,9 @@
             <w:tcW w:w="3322" w:type="dxa"/>
           </w:tcPr>
           <w:p>
-            <w:proofErr w:type="spellStart"/>
             <w:r>
               <w:t>ShowingID</w:t>
             </w:r>
-            <w:proofErr w:type="spellEnd"/>
           </w:p>
         </w:tc>
         <w:tc>
@@ -7585,11 +7359,9 @@
             <w:tcW w:w="3322" w:type="dxa"/>
           </w:tcPr>
           <w:p>
-            <w:proofErr w:type="spellStart"/>
             <w:r>
               <w:t>PerformanceID</w:t>
             </w:r>
-            <w:proofErr w:type="spellEnd"/>
           </w:p>
         </w:tc>
         <w:tc>
@@ -7649,14 +7421,12 @@
             <w:tcW w:w="3322" w:type="dxa"/>
           </w:tcPr>
           <w:p>
-            <w:proofErr w:type="spellStart"/>
             <w:r>
               <w:t>showingD</w:t>
             </w:r>
             <w:r>
               <w:t>ate</w:t>
             </w:r>
-            <w:proofErr w:type="spellEnd"/>
           </w:p>
         </w:tc>
         <w:tc>
@@ -9753,15 +9523,7 @@
           </w:tcPr>
           <w:p>
             <w:r>
-              <w:t>Top left (</w:t>
-            </w:r>
-            <w:proofErr w:type="spellStart"/>
-            <w:r>
-              <w:t>ish</w:t>
-            </w:r>
-            <w:proofErr w:type="spellEnd"/>
-            <w:r>
-              <w:t>) of every visitor page</w:t>
+              <w:t>Top left (ish) of every visitor page</w:t>
             </w:r>
           </w:p>
         </w:tc>
@@ -9852,15 +9614,7 @@
           </w:tcPr>
           <w:p>
             <w:r>
-              <w:t xml:space="preserve">To the left of every performance in the main </w:t>
-            </w:r>
-            <w:proofErr w:type="gramStart"/>
-            <w:r>
-              <w:t>visitors</w:t>
-            </w:r>
-            <w:proofErr w:type="gramEnd"/>
-            <w:r>
-              <w:t xml:space="preserve"> events page</w:t>
+              <w:t>To the left of every performance in the main visitors events page</w:t>
             </w:r>
           </w:p>
         </w:tc>
@@ -9895,15 +9649,7 @@
           </w:tcPr>
           <w:p>
             <w:r>
-              <w:t xml:space="preserve">Date </w:t>
-            </w:r>
-            <w:proofErr w:type="gramStart"/>
-            <w:r>
-              <w:t>select</w:t>
-            </w:r>
-            <w:proofErr w:type="gramEnd"/>
-            <w:r>
-              <w:t xml:space="preserve"> button(s)</w:t>
+              <w:t>Date select button(s)</w:t>
             </w:r>
           </w:p>
         </w:tc>
@@ -10208,15 +9954,7 @@
           </w:tcPr>
           <w:p>
             <w:r>
-              <w:t xml:space="preserve">Checks number of seats </w:t>
-            </w:r>
-            <w:proofErr w:type="gramStart"/>
-            <w:r>
-              <w:t>selected</w:t>
-            </w:r>
-            <w:proofErr w:type="gramEnd"/>
-            <w:r>
-              <w:t xml:space="preserve"> and seat type numbers agree, push to database and </w:t>
+              <w:t xml:space="preserve">Checks number of seats selected and seat type numbers agree, push to database and </w:t>
             </w:r>
             <w:r>
               <w:t>redirect to thank you page</w:t>
@@ -10260,13 +9998,8 @@
           </w:tcPr>
           <w:p>
             <w:r>
-              <w:t xml:space="preserve">Thank </w:t>
-            </w:r>
-            <w:proofErr w:type="gramStart"/>
-            <w:r>
-              <w:t>you page</w:t>
-            </w:r>
-            <w:proofErr w:type="gramEnd"/>
+              <w:t>Thank you page</w:t>
+            </w:r>
           </w:p>
         </w:tc>
         <w:tc>
@@ -10415,15 +10148,7 @@
           </w:tcPr>
           <w:p>
             <w:r>
-              <w:t>Top left (</w:t>
-            </w:r>
-            <w:proofErr w:type="spellStart"/>
-            <w:r>
-              <w:t>ish</w:t>
-            </w:r>
-            <w:proofErr w:type="spellEnd"/>
-            <w:r>
-              <w:t>) of every admin page</w:t>
+              <w:t>Top left (ish) of every admin page</w:t>
             </w:r>
           </w:p>
         </w:tc>
@@ -10990,15 +10715,7 @@
           </w:tcPr>
           <w:p>
             <w:r>
-              <w:t xml:space="preserve">Add date </w:t>
-            </w:r>
-            <w:proofErr w:type="spellStart"/>
-            <w:r>
-              <w:t>date</w:t>
-            </w:r>
-            <w:proofErr w:type="spellEnd"/>
-            <w:r>
-              <w:t xml:space="preserve"> select</w:t>
+              <w:t>Add date date select</w:t>
             </w:r>
           </w:p>
         </w:tc>
@@ -11417,29 +11134,13 @@
     </w:p>
     <w:p>
       <w:r>
-        <w:t xml:space="preserve">The error pictured to the right occurred when trying to add functionality to custom prices for performances. My error was in using the incorrect data type in setting up my database. I used </w:t>
-      </w:r>
-      <w:proofErr w:type="gramStart"/>
-      <w:r>
-        <w:t>DECIMAL</w:t>
-      </w:r>
-      <w:r>
-        <w:t>(</w:t>
-      </w:r>
-      <w:proofErr w:type="gramEnd"/>
-      <w:r>
-        <w:t>2)</w:t>
-      </w:r>
-      <w:r>
-        <w:t xml:space="preserve"> without providing </w:t>
-      </w:r>
-      <w:proofErr w:type="gramStart"/>
-      <w:r>
-        <w:t>a number of</w:t>
-      </w:r>
-      <w:proofErr w:type="gramEnd"/>
-      <w:r>
-        <w:t xml:space="preserve"> decimal places. This meant that values were automatically rounded to the nearest whole number</w:t>
+        <w:t>The error pictured to the right occurred when trying to add functionality to custom prices for performances. My error was in using the incorrect data type in setting up my database. I used DECIMAL</w:t>
+      </w:r>
+      <w:r>
+        <w:t>(2)</w:t>
+      </w:r>
+      <w:r>
+        <w:t xml:space="preserve"> without providing a number of decimal places. This meant that values were automatically rounded to the nearest whole number</w:t>
       </w:r>
       <w:r>
         <w:t>.</w:t>
@@ -11448,13 +11149,8 @@
         <w:t xml:space="preserve"> A similar issue occurred when trying to insert values for price with any more than 2 digits before the decimal point.</w:t>
       </w:r>
       <w:r>
-        <w:t xml:space="preserve"> Corrected by changing SQL table creation command to </w:t>
-      </w:r>
-      <w:proofErr w:type="gramStart"/>
-      <w:r>
-        <w:t>DECIMAL(</w:t>
-      </w:r>
-      <w:proofErr w:type="gramEnd"/>
+        <w:t xml:space="preserve"> Corrected by changing SQL table creation command to DECIMAL(</w:t>
+      </w:r>
       <w:r>
         <w:t>7</w:t>
       </w:r>
@@ -11545,31 +11241,7 @@
     </w:p>
     <w:p>
       <w:r>
-        <w:t xml:space="preserve">This was a simple error that came from me copy and pasting this code </w:t>
-      </w:r>
-      <w:proofErr w:type="gramStart"/>
-      <w:r>
-        <w:t>so as to</w:t>
-      </w:r>
-      <w:proofErr w:type="gramEnd"/>
-      <w:r>
-        <w:t xml:space="preserve"> save myself time. You can see in the screenshot that I forgot to change the str(</w:t>
-      </w:r>
-      <w:proofErr w:type="spellStart"/>
-      <w:r>
-        <w:t>adult_price</w:t>
-      </w:r>
-      <w:proofErr w:type="spellEnd"/>
-      <w:r>
-        <w:t xml:space="preserve">) in the third line to </w:t>
-      </w:r>
-      <w:proofErr w:type="spellStart"/>
-      <w:r>
-        <w:t>elderly_price</w:t>
-      </w:r>
-      <w:proofErr w:type="spellEnd"/>
-      <w:r>
-        <w:t xml:space="preserve">. This meant that </w:t>
+        <w:t xml:space="preserve">This was a simple error that came from me copy and pasting this code so as to save myself time. You can see in the screenshot that I forgot to change the str(adult_price) in the third line to elderly_price. This meant that </w:t>
       </w:r>
       <w:r>
         <w:t>it was not correctly validating the number of decimal places in the number which led to errors. Fortunately, this was caught during my unit testing.</w:t>
@@ -11658,15 +11330,7 @@
     </w:p>
     <w:p>
       <w:r>
-        <w:t xml:space="preserve">This error was another simple one. You can see in the </w:t>
-      </w:r>
-      <w:proofErr w:type="gramStart"/>
-      <w:r>
-        <w:t>warnings</w:t>
-      </w:r>
-      <w:proofErr w:type="gramEnd"/>
-      <w:r>
-        <w:t xml:space="preserve"> summary as well as the code screenshot below that I forgot to </w:t>
+        <w:t xml:space="preserve">This error was another simple one. You can see in the warnings summary as well as the code screenshot below that I forgot to </w:t>
       </w:r>
       <w:r>
         <w:rPr>
@@ -11745,118 +11409,10 @@
         </w:drawing>
       </w:r>
       <w:r>
-        <w:t xml:space="preserve">add the comma in my SQL statement where I insert the variables. It read (“SELECT </w:t>
-      </w:r>
-      <w:proofErr w:type="spellStart"/>
-      <w:r>
-        <w:t>childPrice</w:t>
-      </w:r>
-      <w:proofErr w:type="spellEnd"/>
-      <w:r>
-        <w:t xml:space="preserve">, </w:t>
-      </w:r>
-      <w:proofErr w:type="spellStart"/>
-      <w:r>
-        <w:t>adultPrice</w:t>
-      </w:r>
-      <w:proofErr w:type="spellEnd"/>
-      <w:r>
-        <w:t xml:space="preserve">, </w:t>
-      </w:r>
-      <w:proofErr w:type="spellStart"/>
-      <w:r>
-        <w:t>elderlyPrice</w:t>
-      </w:r>
-      <w:proofErr w:type="spellEnd"/>
-      <w:r>
-        <w:t xml:space="preserve"> FROM </w:t>
-      </w:r>
-      <w:proofErr w:type="spellStart"/>
-      <w:proofErr w:type="gramStart"/>
-      <w:r>
-        <w:t>dbo.Performances</w:t>
-      </w:r>
-      <w:proofErr w:type="spellEnd"/>
-      <w:proofErr w:type="gramEnd"/>
-      <w:r>
-        <w:t xml:space="preserve"> WHERE </w:t>
-      </w:r>
-      <w:proofErr w:type="spellStart"/>
-      <w:r>
-        <w:t>performanceID</w:t>
-      </w:r>
-      <w:proofErr w:type="spellEnd"/>
-      <w:r>
-        <w:t xml:space="preserve"> </w:t>
-      </w:r>
-      <w:proofErr w:type="gramStart"/>
-      <w:r>
-        <w:t>= ?</w:t>
-      </w:r>
-      <w:proofErr w:type="gramEnd"/>
-      <w:r>
-        <w:t>” (</w:t>
-      </w:r>
-      <w:proofErr w:type="spellStart"/>
-      <w:r>
-        <w:t>performanceID</w:t>
-      </w:r>
-      <w:proofErr w:type="spellEnd"/>
-      <w:r>
-        <w:t xml:space="preserve">)) where it should have read </w:t>
-      </w:r>
-      <w:r>
-        <w:t xml:space="preserve">(“SELECT </w:t>
-      </w:r>
-      <w:proofErr w:type="spellStart"/>
-      <w:r>
-        <w:t>childPrice</w:t>
-      </w:r>
-      <w:proofErr w:type="spellEnd"/>
-      <w:r>
-        <w:t xml:space="preserve">, </w:t>
-      </w:r>
-      <w:proofErr w:type="spellStart"/>
-      <w:r>
-        <w:t>adultPrice</w:t>
-      </w:r>
-      <w:proofErr w:type="spellEnd"/>
-      <w:r>
-        <w:t xml:space="preserve">, </w:t>
-      </w:r>
-      <w:proofErr w:type="spellStart"/>
-      <w:r>
-        <w:t>elderlyPrice</w:t>
-      </w:r>
-      <w:proofErr w:type="spellEnd"/>
-      <w:r>
-        <w:t xml:space="preserve"> FROM </w:t>
-      </w:r>
-      <w:proofErr w:type="spellStart"/>
-      <w:proofErr w:type="gramStart"/>
-      <w:r>
-        <w:t>dbo.Performances</w:t>
-      </w:r>
-      <w:proofErr w:type="spellEnd"/>
-      <w:proofErr w:type="gramEnd"/>
-      <w:r>
-        <w:t xml:space="preserve"> WHERE </w:t>
-      </w:r>
-      <w:proofErr w:type="spellStart"/>
-      <w:r>
-        <w:t>performanceID</w:t>
-      </w:r>
-      <w:proofErr w:type="spellEnd"/>
-      <w:r>
-        <w:t xml:space="preserve"> </w:t>
-      </w:r>
-      <w:proofErr w:type="gramStart"/>
-      <w:r>
-        <w:t>= ?</w:t>
-      </w:r>
-      <w:proofErr w:type="gramEnd"/>
-      <w:r>
-        <w:t>”</w:t>
+        <w:t xml:space="preserve">add the comma in my SQL statement where I insert the variables. It read (“SELECT childPrice, adultPrice, elderlyPrice FROM dbo.Performances WHERE performanceID = ?” (performanceID)) where it should have read </w:t>
+      </w:r>
+      <w:r>
+        <w:t>(“SELECT childPrice, adultPrice, elderlyPrice FROM dbo.Performances WHERE performanceID = ?”</w:t>
       </w:r>
       <w:r>
         <w:rPr>
@@ -11867,18 +11423,99 @@
         <w:t>,</w:t>
       </w:r>
       <w:r>
-        <w:t xml:space="preserve"> (</w:t>
-      </w:r>
-      <w:proofErr w:type="spellStart"/>
-      <w:r>
-        <w:t>performanceID</w:t>
-      </w:r>
-      <w:proofErr w:type="spellEnd"/>
-      <w:r>
-        <w:t>))</w:t>
+        <w:t xml:space="preserve"> (performanceID))</w:t>
       </w:r>
       <w:r>
         <w:t>.</w:t>
+      </w:r>
+    </w:p>
+    <w:p/>
+    <w:p>
+      <w:r>
+        <w:rPr>
+          <w:noProof/>
+        </w:rPr>
+        <w:drawing>
+          <wp:anchor distT="0" distB="0" distL="114300" distR="114300" simplePos="0" relativeHeight="251704320" behindDoc="1" locked="0" layoutInCell="1" allowOverlap="1" wp14:anchorId="2214DF10" wp14:editId="244C2876">
+            <wp:simplePos x="0" y="0"/>
+            <wp:positionH relativeFrom="margin">
+              <wp:align>right</wp:align>
+            </wp:positionH>
+            <wp:positionV relativeFrom="paragraph">
+              <wp:posOffset>5080</wp:posOffset>
+            </wp:positionV>
+            <wp:extent cx="6529705" cy="586740"/>
+            <wp:effectExtent l="0" t="0" r="4445" b="3810"/>
+            <wp:wrapTight wrapText="bothSides">
+              <wp:wrapPolygon edited="0">
+                <wp:start x="0" y="0"/>
+                <wp:lineTo x="0" y="21039"/>
+                <wp:lineTo x="21552" y="21039"/>
+                <wp:lineTo x="21552" y="0"/>
+                <wp:lineTo x="0" y="0"/>
+              </wp:wrapPolygon>
+            </wp:wrapTight>
+            <wp:docPr id="1182313937" name="Picture 5"/>
+            <wp:cNvGraphicFramePr>
+              <a:graphicFrameLocks xmlns:a="http://schemas.openxmlformats.org/drawingml/2006/main" noChangeAspect="1"/>
+            </wp:cNvGraphicFramePr>
+            <a:graphic xmlns:a="http://schemas.openxmlformats.org/drawingml/2006/main">
+              <a:graphicData uri="http://schemas.openxmlformats.org/drawingml/2006/picture">
+                <pic:pic xmlns:pic="http://schemas.openxmlformats.org/drawingml/2006/picture">
+                  <pic:nvPicPr>
+                    <pic:cNvPr id="0" name="Picture 5"/>
+                    <pic:cNvPicPr>
+                      <a:picLocks noChangeAspect="1" noChangeArrowheads="1"/>
+                    </pic:cNvPicPr>
+                  </pic:nvPicPr>
+                  <pic:blipFill>
+                    <a:blip r:embed="rId35">
+                      <a:extLst>
+                        <a:ext uri="{28A0092B-C50C-407E-A947-70E740481C1C}">
+                          <a14:useLocalDpi xmlns:a14="http://schemas.microsoft.com/office/drawing/2010/main" val="0"/>
+                        </a:ext>
+                      </a:extLst>
+                    </a:blip>
+                    <a:srcRect/>
+                    <a:stretch>
+                      <a:fillRect/>
+                    </a:stretch>
+                  </pic:blipFill>
+                  <pic:spPr bwMode="auto">
+                    <a:xfrm>
+                      <a:off x="0" y="0"/>
+                      <a:ext cx="6529705" cy="586740"/>
+                    </a:xfrm>
+                    <a:prstGeom prst="rect">
+                      <a:avLst/>
+                    </a:prstGeom>
+                    <a:noFill/>
+                    <a:ln>
+                      <a:noFill/>
+                    </a:ln>
+                  </pic:spPr>
+                </pic:pic>
+              </a:graphicData>
+            </a:graphic>
+            <wp14:sizeRelH relativeFrom="page">
+              <wp14:pctWidth>0</wp14:pctWidth>
+            </wp14:sizeRelH>
+            <wp14:sizeRelV relativeFrom="page">
+              <wp14:pctHeight>0</wp14:pctHeight>
+            </wp14:sizeRelV>
+          </wp:anchor>
+        </w:drawing>
+      </w:r>
+      <w:r>
+        <w:t>Error #4:</w:t>
+      </w:r>
+    </w:p>
+    <w:p>
+      <w:r>
+        <w:t xml:space="preserve">This is another simple error that stems from me using the incorrect data type in my declaration of tables. In my data dictionary, I declared seatID to be </w:t>
+      </w:r>
+      <w:r>
+        <w:t>VARCHAR(3) but I unfortunately neglected to do this when actually making the table and defaulted to INT.</w:t>
       </w:r>
     </w:p>
     <w:p/>

</xml_diff>

<commit_message>
Now makes ticket with all valid data, still have to format
</commit_message>
<xml_diff>
--- a/documentation/George Cooke - Theatre Booking Documentation.docx
+++ b/documentation/George Cooke - Theatre Booking Documentation.docx
@@ -2639,7 +2639,7 @@
           <w:noProof/>
         </w:rPr>
         <w:drawing>
-          <wp:anchor distT="0" distB="0" distL="114300" distR="114300" simplePos="0" relativeHeight="251671552" behindDoc="0" locked="0" layoutInCell="1" allowOverlap="1" wp14:anchorId="54089481" wp14:editId="49B5A799">
+          <wp:anchor distT="0" distB="0" distL="114300" distR="114300" simplePos="0" relativeHeight="251671552" behindDoc="0" locked="0" layoutInCell="1" allowOverlap="1" wp14:anchorId="54089481" wp14:editId="03C6C623">
             <wp:simplePos x="0" y="0"/>
             <wp:positionH relativeFrom="margin">
               <wp:posOffset>0</wp:posOffset>
@@ -8916,10 +8916,7 @@
           </w:tcPr>
           <w:p>
             <w:r>
-              <w:t>R</w:t>
-            </w:r>
-            <w:r>
-              <w:t>edirects to relevant dashboard</w:t>
+              <w:t>Redirects to relevant dashboard</w:t>
             </w:r>
           </w:p>
         </w:tc>
@@ -8998,10 +8995,7 @@
           </w:tcPr>
           <w:p>
             <w:r>
-              <w:t>Create account page (</w:t>
-            </w:r>
-            <w:r>
-              <w:t>1</w:t>
+              <w:t>Create account page (1</w:t>
             </w:r>
             <w:r>
               <w:rPr>
@@ -9019,10 +9013,7 @@
               <w:t>st</w:t>
             </w:r>
             <w:r>
-              <w:t xml:space="preserve"> column</w:t>
-            </w:r>
-            <w:r>
-              <w:t>)</w:t>
+              <w:t xml:space="preserve"> column)</w:t>
             </w:r>
           </w:p>
         </w:tc>
@@ -9067,10 +9058,7 @@
           </w:tcPr>
           <w:p>
             <w:r>
-              <w:t>Create account page (</w:t>
-            </w:r>
-            <w:r>
-              <w:t>2</w:t>
+              <w:t>Create account page (2</w:t>
             </w:r>
             <w:r>
               <w:rPr>
@@ -9088,10 +9076,7 @@
               <w:t>st</w:t>
             </w:r>
             <w:r>
-              <w:t xml:space="preserve"> column</w:t>
-            </w:r>
-            <w:r>
-              <w:t>)</w:t>
+              <w:t xml:space="preserve"> column)</w:t>
             </w:r>
           </w:p>
         </w:tc>
@@ -9136,10 +9121,7 @@
           </w:tcPr>
           <w:p>
             <w:r>
-              <w:t>Create account page (</w:t>
-            </w:r>
-            <w:r>
-              <w:t>3</w:t>
+              <w:t>Create account page (3</w:t>
             </w:r>
             <w:r>
               <w:rPr>
@@ -9157,10 +9139,7 @@
               <w:t>st</w:t>
             </w:r>
             <w:r>
-              <w:t xml:space="preserve"> column</w:t>
-            </w:r>
-            <w:r>
-              <w:t>)</w:t>
+              <w:t xml:space="preserve"> column)</w:t>
             </w:r>
           </w:p>
         </w:tc>
@@ -9205,10 +9184,7 @@
           </w:tcPr>
           <w:p>
             <w:r>
-              <w:t>Create account page (</w:t>
-            </w:r>
-            <w:r>
-              <w:t>1</w:t>
+              <w:t>Create account page (1</w:t>
             </w:r>
             <w:r>
               <w:rPr>
@@ -9226,10 +9202,7 @@
               <w:t>nd</w:t>
             </w:r>
             <w:r>
-              <w:t xml:space="preserve"> column</w:t>
-            </w:r>
-            <w:r>
-              <w:t>)</w:t>
+              <w:t xml:space="preserve"> column)</w:t>
             </w:r>
           </w:p>
         </w:tc>
@@ -9274,10 +9247,7 @@
           </w:tcPr>
           <w:p>
             <w:r>
-              <w:t>Create account page (</w:t>
-            </w:r>
-            <w:r>
-              <w:t>2</w:t>
+              <w:t>Create account page (2</w:t>
             </w:r>
             <w:r>
               <w:rPr>
@@ -9295,10 +9265,7 @@
               <w:t>nd</w:t>
             </w:r>
             <w:r>
-              <w:t xml:space="preserve"> column</w:t>
-            </w:r>
-            <w:r>
-              <w:t>)</w:t>
+              <w:t xml:space="preserve"> column)</w:t>
             </w:r>
           </w:p>
         </w:tc>
@@ -9343,10 +9310,7 @@
           </w:tcPr>
           <w:p>
             <w:r>
-              <w:t>Create account page (</w:t>
-            </w:r>
-            <w:r>
-              <w:t>3</w:t>
+              <w:t>Create account page (3</w:t>
             </w:r>
             <w:r>
               <w:rPr>
@@ -9364,10 +9328,7 @@
               <w:t>nd</w:t>
             </w:r>
             <w:r>
-              <w:t xml:space="preserve"> column</w:t>
-            </w:r>
-            <w:r>
-              <w:t>)</w:t>
+              <w:t xml:space="preserve"> column)</w:t>
             </w:r>
           </w:p>
         </w:tc>
@@ -9412,13 +9373,7 @@
           </w:tcPr>
           <w:p>
             <w:r>
-              <w:t>Create account page (</w:t>
-            </w:r>
-            <w:r>
-              <w:t>bottom row</w:t>
-            </w:r>
-            <w:r>
-              <w:t>)</w:t>
+              <w:t>Create account page (bottom row)</w:t>
             </w:r>
           </w:p>
         </w:tc>
@@ -9428,10 +9383,7 @@
           </w:tcPr>
           <w:p>
             <w:r>
-              <w:t xml:space="preserve">Checks email is not in database, checks passwords are the same, passes data into database, </w:t>
-            </w:r>
-            <w:r>
-              <w:t>redirects to sign in page</w:t>
+              <w:t>Checks email is not in database, checks passwords are the same, passes data into database, redirects to sign in page</w:t>
             </w:r>
           </w:p>
         </w:tc>
@@ -9441,10 +9393,7 @@
           </w:tcPr>
           <w:p>
             <w:r>
-              <w:t>R</w:t>
-            </w:r>
-            <w:r>
-              <w:t>edirects to sign in page</w:t>
+              <w:t>Redirects to sign in page</w:t>
             </w:r>
           </w:p>
         </w:tc>
@@ -9802,13 +9751,7 @@
           </w:tcPr>
           <w:p>
             <w:r>
-              <w:t xml:space="preserve">Number of </w:t>
-            </w:r>
-            <w:r>
-              <w:t>children</w:t>
-            </w:r>
-            <w:r>
-              <w:t xml:space="preserve"> seats number select</w:t>
+              <w:t>Number of children seats number select</w:t>
             </w:r>
           </w:p>
         </w:tc>
@@ -9818,10 +9761,7 @@
           </w:tcPr>
           <w:p>
             <w:r>
-              <w:t xml:space="preserve">Right hand column, </w:t>
-            </w:r>
-            <w:r>
-              <w:t>2</w:t>
+              <w:t>Right hand column, 2</w:t>
             </w:r>
             <w:r>
               <w:rPr>
@@ -9830,10 +9770,7 @@
               <w:t>nd</w:t>
             </w:r>
             <w:r>
-              <w:t xml:space="preserve"> </w:t>
-            </w:r>
-            <w:r>
-              <w:t>row of booking page</w:t>
+              <w:t xml:space="preserve"> row of booking page</w:t>
             </w:r>
           </w:p>
         </w:tc>
@@ -9868,13 +9805,7 @@
           </w:tcPr>
           <w:p>
             <w:r>
-              <w:t xml:space="preserve">Number of </w:t>
-            </w:r>
-            <w:r>
-              <w:t>elderly</w:t>
-            </w:r>
-            <w:r>
-              <w:t xml:space="preserve"> seats number select</w:t>
+              <w:t>Number of elderly seats number select</w:t>
             </w:r>
           </w:p>
         </w:tc>
@@ -9884,10 +9815,7 @@
           </w:tcPr>
           <w:p>
             <w:r>
-              <w:t xml:space="preserve">Right hand column, </w:t>
-            </w:r>
-            <w:r>
-              <w:t>3</w:t>
+              <w:t>Right hand column, 3</w:t>
             </w:r>
             <w:r>
               <w:rPr>
@@ -9896,10 +9824,7 @@
               <w:t>rd</w:t>
             </w:r>
             <w:r>
-              <w:t xml:space="preserve"> </w:t>
-            </w:r>
-            <w:r>
-              <w:t>row of booking page</w:t>
+              <w:t xml:space="preserve"> row of booking page</w:t>
             </w:r>
           </w:p>
         </w:tc>
@@ -9954,10 +9879,7 @@
           </w:tcPr>
           <w:p>
             <w:r>
-              <w:t xml:space="preserve">Checks number of seats selected and seat type numbers agree, push to database and </w:t>
-            </w:r>
-            <w:r>
-              <w:t>redirect to thank you page</w:t>
+              <w:t>Checks number of seats selected and seat type numbers agree, push to database and redirect to thank you page</w:t>
             </w:r>
           </w:p>
         </w:tc>
@@ -9967,10 +9889,7 @@
           </w:tcPr>
           <w:p>
             <w:r>
-              <w:t>R</w:t>
-            </w:r>
-            <w:r>
-              <w:t>edirect to thank you page</w:t>
+              <w:t>Redirect to thank you page</w:t>
             </w:r>
           </w:p>
         </w:tc>
@@ -10595,10 +10514,7 @@
           </w:tcPr>
           <w:p>
             <w:r>
-              <w:t>Child</w:t>
-            </w:r>
-            <w:r>
-              <w:t xml:space="preserve"> price number entry (decimal)</w:t>
+              <w:t>Child price number entry (decimal)</w:t>
             </w:r>
           </w:p>
         </w:tc>
@@ -10655,10 +10571,7 @@
           </w:tcPr>
           <w:p>
             <w:r>
-              <w:t>Elderly</w:t>
-            </w:r>
-            <w:r>
-              <w:t xml:space="preserve"> price number entry (decimal)</w:t>
+              <w:t>Elderly price number entry (decimal)</w:t>
             </w:r>
           </w:p>
         </w:tc>
@@ -11069,6 +10982,7 @@
         <w:rPr>
           <w:b/>
           <w:bCs/>
+          <w:noProof/>
         </w:rPr>
         <w:drawing>
           <wp:anchor distT="0" distB="0" distL="114300" distR="114300" simplePos="0" relativeHeight="251700224" behindDoc="0" locked="0" layoutInCell="1" allowOverlap="1" wp14:anchorId="4FF1BFB8" wp14:editId="4FED299E">
@@ -11409,10 +11323,7 @@
         </w:drawing>
       </w:r>
       <w:r>
-        <w:t xml:space="preserve">add the comma in my SQL statement where I insert the variables. It read (“SELECT childPrice, adultPrice, elderlyPrice FROM dbo.Performances WHERE performanceID = ?” (performanceID)) where it should have read </w:t>
-      </w:r>
-      <w:r>
-        <w:t>(“SELECT childPrice, adultPrice, elderlyPrice FROM dbo.Performances WHERE performanceID = ?”</w:t>
+        <w:t>add the comma in my SQL statement where I insert the variables. It read (“SELECT childPrice, adultPrice, elderlyPrice FROM dbo.Performances WHERE performanceID = ?” (performanceID)) where it should have read (“SELECT childPrice, adultPrice, elderlyPrice FROM dbo.Performances WHERE performanceID = ?”</w:t>
       </w:r>
       <w:r>
         <w:rPr>
@@ -11423,10 +11334,7 @@
         <w:t>,</w:t>
       </w:r>
       <w:r>
-        <w:t xml:space="preserve"> (performanceID))</w:t>
-      </w:r>
-      <w:r>
-        <w:t>.</w:t>
+        <w:t xml:space="preserve"> (performanceID)).</w:t>
       </w:r>
     </w:p>
     <w:p/>
@@ -12123,7 +12031,6 @@
         <w:docPartUnique/>
       </w:docPartObj>
     </w:sdtPr>
-    <w:sdtEndPr/>
     <w:sdtContent>
       <w:p>
         <w:pPr>

</xml_diff>

<commit_message>
Added validation for no user ID on all visitor pages
</commit_message>
<xml_diff>
--- a/documentation/George Cooke - Theatre Booking Documentation.docx
+++ b/documentation/George Cooke - Theatre Booking Documentation.docx
@@ -2639,7 +2639,7 @@
           <w:noProof/>
         </w:rPr>
         <w:drawing>
-          <wp:anchor distT="0" distB="0" distL="114300" distR="114300" simplePos="0" relativeHeight="251671552" behindDoc="0" locked="0" layoutInCell="1" allowOverlap="1" wp14:anchorId="54089481" wp14:editId="0E9F6F4A">
+          <wp:anchor distT="0" distB="0" distL="114300" distR="114300" simplePos="0" relativeHeight="251671552" behindDoc="0" locked="0" layoutInCell="1" allowOverlap="1" wp14:anchorId="54089481" wp14:editId="46233A91">
             <wp:simplePos x="0" y="0"/>
             <wp:positionH relativeFrom="margin">
               <wp:posOffset>0</wp:posOffset>
@@ -11431,7 +11431,7 @@
     <w:bookmarkEnd w:id="0"/>
     <w:p>
       <w:r>
-        <w:object w:dxaOrig="14491" w:dyaOrig="7476" w14:anchorId="3F010BD7">
+        <w:object w:dxaOrig="14491" w:dyaOrig="4960" w14:anchorId="3F010BD7">
           <v:shapetype id="_x0000_t75" coordsize="21600,21600" o:spt="75" o:preferrelative="t" path="m@4@5l@4@11@9@11@9@5xe" filled="f" stroked="f">
             <v:stroke joinstyle="miter"/>
             <v:formulas>
@@ -11451,10 +11451,10 @@
             <v:path o:extrusionok="f" gradientshapeok="t" o:connecttype="rect"/>
             <o:lock v:ext="edit" aspectratio="t"/>
           </v:shapetype>
-          <v:shape id="_x0000_i1084" type="#_x0000_t75" style="width:724.8pt;height:373.8pt" o:ole="">
+          <v:shape id="_x0000_i1048" type="#_x0000_t75" style="width:724.8pt;height:247.8pt" o:ole="">
             <v:imagedata r:id="rId36" o:title=""/>
           </v:shape>
-          <o:OLEObject Type="Embed" ProgID="Excel.Sheet.12" ShapeID="_x0000_i1084" DrawAspect="Content" ObjectID="_1838451766" r:id="rId37"/>
+          <o:OLEObject Type="Embed" ProgID="Excel.Sheet.12" ShapeID="_x0000_i1048" DrawAspect="Content" ObjectID="_1838463016" r:id="rId37"/>
         </w:object>
       </w:r>
       <w:r>
@@ -11724,7 +11724,6 @@
         <w:docPartUnique/>
       </w:docPartObj>
     </w:sdtPr>
-    <w:sdtEndPr/>
     <w:sdtContent>
       <w:p>
         <w:pPr>

</xml_diff>

<commit_message>
Fixed user logout option not appearing in thank you page
</commit_message>
<xml_diff>
--- a/documentation/George Cooke - Theatre Booking Documentation.docx
+++ b/documentation/George Cooke - Theatre Booking Documentation.docx
@@ -11431,7 +11431,7 @@
     <w:bookmarkEnd w:id="0"/>
     <w:p>
       <w:r>
-        <w:object w:dxaOrig="14491" w:dyaOrig="4960" w14:anchorId="3F010BD7">
+        <w:object w:dxaOrig="14491" w:dyaOrig="14306" w14:anchorId="3F010BD7">
           <v:shapetype id="_x0000_t75" coordsize="21600,21600" o:spt="75" o:preferrelative="t" path="m@4@5l@4@11@9@11@9@5xe" filled="f" stroked="f">
             <v:stroke joinstyle="miter"/>
             <v:formulas>
@@ -11451,10 +11451,10 @@
             <v:path o:extrusionok="f" gradientshapeok="t" o:connecttype="rect"/>
             <o:lock v:ext="edit" aspectratio="t"/>
           </v:shapetype>
-          <v:shape id="_x0000_i1048" type="#_x0000_t75" style="width:724.8pt;height:247.8pt" o:ole="">
+          <v:shape id="_x0000_i1070" type="#_x0000_t75" style="width:724.8pt;height:715.2pt" o:ole="">
             <v:imagedata r:id="rId36" o:title=""/>
           </v:shape>
-          <o:OLEObject Type="Embed" ProgID="Excel.Sheet.12" ShapeID="_x0000_i1048" DrawAspect="Content" ObjectID="_1838463016" r:id="rId37"/>
+          <o:OLEObject Type="Embed" ProgID="Excel.Sheet.12" ShapeID="_x0000_i1070" DrawAspect="Content" ObjectID="_1838487495" r:id="rId37"/>
         </w:object>
       </w:r>
       <w:r>
@@ -11724,6 +11724,7 @@
         <w:docPartUnique/>
       </w:docPartObj>
     </w:sdtPr>
+    <w:sdtEndPr/>
     <w:sdtContent>
       <w:p>
         <w:pPr>

</xml_diff>